<commit_message>
Consolidate reviews and update PRD v0.4 and TRD v0.3
Add the three source reviews and a consolidated, verified review.
PRD v0.4 records the owner decisions: runtimes below the capability
floor ship observed-only, FR-025 moves to P1, backup and export become
P0 (FR-043), and a session supervisor keeps sessions alive across
service restarts. TRD v0.3 aligns with these (TR-006, TR-065, TR-073-074,
TR-091) and updates traceability.
</commit_message>
<xml_diff>
--- a/docs/Robin_PRD.docx
+++ b/docs/Robin_PRD.docx
@@ -43,7 +43,7 @@
           <w:color w:val="000000"/>
           <w:sz w:val="34"/>
         </w:rPr>
-        <w:t>A local workspace for running observing and coordinating coding agents</w:t>
+        <w:t>A local workspace for running, observing, and coordinating coding agents</w:t>
       </w:r>
     </w:p>
     <w:p>
@@ -133,7 +133,7 @@
         <w:rPr>
           <w:b w:val="0"/>
         </w:rPr>
-        <w:t xml:space="preserve"> 0.2 - Managed workspace and live activity dashboard</w:t>
+        <w:t xml:space="preserve"> 0.4 - Owner decisions: runtime floor, priorities, and session supervisor</w:t>
       </w:r>
     </w:p>
     <w:p>
@@ -151,7 +151,7 @@
         <w:rPr>
           <w:b w:val="0"/>
         </w:rPr>
-        <w:t xml:space="preserve"> October 14, 2026</w:t>
+        <w:t xml:space="preserve"> October 15, 2026</w:t>
       </w:r>
     </w:p>
     <w:p>
@@ -187,7 +187,7 @@
         <w:rPr>
           <w:b w:val="0"/>
         </w:rPr>
-        <w:t xml:space="preserve"> Product direction agreed; implementation pending</w:t>
+        <w:t xml:space="preserve"> Product direction agreed; Phase 0 validation pending; implementation pending</w:t>
       </w:r>
     </w:p>
     <w:p>
@@ -266,7 +266,47 @@
         <w:keepNext/>
       </w:pPr>
       <w:r>
-        <w:t>Version 0 2 changes</w:t>
+        <w:t>Version 0.4 changes</w:t>
+      </w:r>
+    </w:p>
+    <w:p>
+      <w:pPr>
+        <w:keepLines/>
+      </w:pPr>
+      <w:r>
+        <w:rPr>
+          <w:b w:val="0"/>
+        </w:rPr>
+        <w:t>This revision records three owner decisions from the v0.3 open items. A runtime that misses the minimum capability floor in Phase 0 ships observed-only while the others ship with live control. Loop prevention (FR-025) moves to P1, with derived-artifact labels kept in the P0 context preview. Backup and export become a P0 requirement (FR-043). A detached session supervisor owns managed runtime processes so sessions survive a Robin service restart.</w:t>
+      </w:r>
+    </w:p>
+    <w:p>
+      <w:pPr>
+        <w:pStyle w:val="Heading2"/>
+        <w:keepNext/>
+      </w:pPr>
+      <w:r>
+        <w:t>Version 0.3 changes</w:t>
+      </w:r>
+    </w:p>
+    <w:p>
+      <w:pPr>
+        <w:keepLines/>
+      </w:pPr>
+      <w:r>
+        <w:rPr>
+          <w:b w:val="0"/>
+        </w:rPr>
+        <w:t>This revision applies the consolidated review of v0.2 (docs/review-consolidated.md). It defines the independence boundary for reviews, starts a fresh native session for work on a different task, adds a control-ownership rule for native terminal handoff, makes finding publication a required adapter path with trusted attribution, records launch permission settings, and covers prompt injection and hook consent. The Technical Requirements document now owns the storage layout and finding schema; this document points to it.</w:t>
+      </w:r>
+    </w:p>
+    <w:p>
+      <w:pPr>
+        <w:pStyle w:val="Heading2"/>
+        <w:keepNext/>
+      </w:pPr>
+      <w:r>
+        <w:t>Version 0.2 changes</w:t>
       </w:r>
     </w:p>
     <w:p>
@@ -382,7 +422,7 @@
           <w:color w:val="202733"/>
           <w:sz w:val="21"/>
         </w:rPr>
-        <w:t>Let agents publish structured findings into a shared task workspace.</w:t>
+        <w:t>Let agents publish structured findings to the task through a validated, attributed publication path.</w:t>
       </w:r>
     </w:p>
     <w:p>
@@ -424,6 +464,10 @@
     <w:p>
       <w:pPr>
         <w:keepLines/>
+        <w:numPr>
+          <w:ilvl w:val="0"/>
+          <w:numId w:val="10"/>
+        </w:numPr>
       </w:pPr>
       <w:r>
         <w:rPr>
@@ -591,7 +635,7 @@
         <w:rPr>
           <w:color w:val="000000"/>
         </w:rPr>
-        <w:t>3  Goals non goals and principles</w:t>
+        <w:t xml:space="preserve">3  Goals, non-goals, and principles</w:t>
       </w:r>
     </w:p>
     <w:p>
@@ -719,7 +763,7 @@
         <w:keepLines/>
       </w:pPr>
       <w:r>
-        <w:t>Non goals for MVP</w:t>
+        <w:t>Non-goals for MVP</w:t>
       </w:r>
     </w:p>
     <w:p>
@@ -841,6 +885,10 @@
     <w:p>
       <w:pPr>
         <w:keepLines/>
+        <w:numPr>
+          <w:ilvl w:val="0"/>
+          <w:numId w:val="13"/>
+        </w:numPr>
       </w:pPr>
       <w:r>
         <w:rPr>
@@ -2286,7 +2334,7 @@
                 <w:color w:val="000000"/>
                 <w:sz w:val="20"/>
               </w:rPr>
-              <w:t>MVP v0.2 specification</w:t>
+              <w:t>MVP specification</w:t>
             </w:r>
           </w:p>
         </w:tc>
@@ -2871,7 +2919,7 @@
                 <w:color w:val="000000"/>
                 <w:sz w:val="20"/>
               </w:rPr>
-              <w:t>Claude Code, Codex, and Pi through versioned adapters.</w:t>
+              <w:t>Claude Code, Codex, and Pi through versioned adapters. A runtime below the capability floor ships observed-only.</w:t>
             </w:r>
           </w:p>
         </w:tc>
@@ -3157,7 +3205,7 @@
                 <w:color w:val="000000"/>
                 <w:sz w:val="21"/>
               </w:rPr>
-              <w:t>The project is assigned a stable ID and displays its path, repository remote, current branch, and last activity.</w:t>
+              <w:t>The project is assigned a stable ID and displays its path and last activity, plus repository remote and current branch when the directory is a Git repository.</w:t>
             </w:r>
           </w:p>
         </w:tc>
@@ -3302,7 +3350,7 @@
                 <w:color w:val="000000"/>
                 <w:sz w:val="21"/>
               </w:rPr>
-              <w:t>A task directory and database record are created without modifying attached source files.</w:t>
+              <w:t>A task record is created in Robin's artifact store without modifying attached source files. The store is outside the project directory by default; see the Technical Requirements.</w:t>
             </w:r>
           </w:p>
         </w:tc>
@@ -3877,7 +3925,7 @@
                 <w:color w:val="000000"/>
                 <w:sz w:val="21"/>
               </w:rPr>
-              <w:t>Robin launches a selected installed harness through a supported SDK, protocol, or CLI in the task directory or worktree.</w:t>
+              <w:t>Robin launches a selected installed harness through a supported SDK, protocol, or CLI. The execution directory is the project root or a selected worktree; Robin's artifact store is never the working directory.</w:t>
             </w:r>
           </w:p>
           <w:p>
@@ -3898,7 +3946,7 @@
                 <w:color w:val="000000"/>
                 <w:sz w:val="21"/>
               </w:rPr>
-              <w:t>Record configuration, working directory, native ID, and capability report. Use the runtime's supported authentication flow and report missing prerequisites.</w:t>
+              <w:t>Record configuration, working directory, native ID, capability report, permission mode, sandbox, and loaded settings sources. Load the user's harness settings by default and never select a mode more permissive than the harness default. Use the runtime's supported authentication flow and report missing prerequisites.</w:t>
             </w:r>
           </w:p>
         </w:tc>
@@ -4045,7 +4093,7 @@
                 <w:color w:val="000000"/>
                 <w:sz w:val="21"/>
               </w:rPr>
-              <w:t>Reconcile current state before resume; do not duplicate an active run or convert it to a different harness. Provide a native terminal fallback when required.</w:t>
+              <w:t>Reconcile current state before resume; do not duplicate an active run or convert it to a different harness. Work for a different task starts a new native session by default; continuing an existing session under another task requires confirmation and discloses the context it retains. A run's task is fixed when the run starts. Provide a native terminal fallback when required.</w:t>
             </w:r>
           </w:p>
         </w:tc>
@@ -4118,6 +4166,7 @@
             </w:pPr>
             <w:r>
               <w:rPr>
+                <w:b/>
                 <w:color w:val="000000"/>
                 <w:sz w:val="21"/>
               </w:rPr>
@@ -4169,7 +4218,7 @@
                 <w:color w:val="000000"/>
                 <w:sz w:val="21"/>
               </w:rPr>
-              <w:t>Report running, waiting for input, idle, failed, stopped, or unknown from explicit events and supported observations. Track task completion separately.</w:t>
+              <w:t>Report running, waiting for input, idle, failed, stopped, or unknown from explicit events and supported observations. Track task status separately as open, completed, or abandoned; archive is a visibility flag.</w:t>
             </w:r>
           </w:p>
           <w:p>
@@ -4190,7 +4239,7 @@
                 <w:color w:val="000000"/>
                 <w:sz w:val="21"/>
               </w:rPr>
-              <w:t>Store evidence source and freshness. End of turn or process exit is not task success; show agent-reported completion separately from verified checks. Silence alone does not mean completed.</w:t>
+              <w:t>Store evidence source and freshness. Only an explicit user decision with recorded evidence completes a task. End of turn or process exit is not task success; show agent-reported completion separately from verified checks. Silence alone does not mean completed.</w:t>
             </w:r>
           </w:p>
         </w:tc>
@@ -4595,7 +4644,7 @@
                 <w:color w:val="000000"/>
                 <w:sz w:val="21"/>
               </w:rPr>
-              <w:t>Route only explicit user responses to the original runtime. Expired requests cannot be approved. Missing approval support opens the native interface; no automatic approval fallback.</w:t>
+              <w:t>Route only explicit user responses to the original runtime. A request expires when the runtime reports expiry or, where it has none, when its run ends, is interrupted, or loses its connection generation; expired requests cannot be approved. Missing approval support opens the native interface; no automatic approval fallback.</w:t>
             </w:r>
           </w:p>
         </w:tc>
@@ -4731,7 +4780,7 @@
                 <w:color w:val="000000"/>
                 <w:sz w:val="21"/>
               </w:rPr>
-              <w:t>An observed session can be read-only. Unsupported controls are disabled with a reason; discovery never implies live control.</w:t>
+              <w:t>An observed session can be read-only. Unsupported controls are disabled with a reason; discovery never implies live control. Reports include terminal mode, finding publication path, and whether review independence is enforced.</w:t>
             </w:r>
           </w:p>
         </w:tc>
@@ -4866,7 +4915,7 @@
                 <w:color w:val="000000"/>
                 <w:sz w:val="21"/>
               </w:rPr>
-              <w:t>An agent or user can publish a structured finding artifact to the shared task.</w:t>
+              <w:t>An agent or the user can publish a structured finding to the task. Every adapter supports at least one validated publication path: task-scoped MCP or a structured final-message block parsed from the session's own events.</w:t>
             </w:r>
           </w:p>
           <w:p>
@@ -4889,7 +4938,7 @@
                 <w:color w:val="000000"/>
                 <w:sz w:val="21"/>
               </w:rPr>
-              <w:t>The artifact records authoring agent, source session, creation time, summary, findings, evidence references, recommendations, and unresolved questions.</w:t>
+              <w:t>The finding records an author (user, or agent with runtime, native session, and run), creation time, summary, claims with evidence references, recommendations, and unresolved questions. Attribution comes from the publishing session, never from file contents. Versions are immutable; invalid or duplicate submissions are rejected visibly.</w:t>
             </w:r>
           </w:p>
         </w:tc>
@@ -5179,7 +5228,7 @@
                 <w:color w:val="000000"/>
                 <w:sz w:val="21"/>
               </w:rPr>
-              <w:t>The target sees source attribution and can request referenced excerpts when more evidence is needed.</w:t>
+              <w:t>The target sees source attribution and can request referenced excerpts when more evidence is needed. Agent retrieval uses a revocable grant bound to the session, task, and exact approved versions; every retrieval is recorded against a manifest.</w:t>
             </w:r>
           </w:p>
         </w:tc>
@@ -5252,6 +5301,7 @@
             </w:pPr>
             <w:r>
               <w:rPr>
+                <w:b/>
                 <w:color w:val="000000"/>
                 <w:sz w:val="21"/>
               </w:rPr>
@@ -5446,7 +5496,7 @@
                 <w:color w:val="000000"/>
                 <w:sz w:val="21"/>
               </w:rPr>
-              <w:t>The user can ask a selected agent to compare or synthesize chosen findings.</w:t>
+              <w:t>The user can ask a selected agent to compare or synthesize chosen findings, identified by finding ID.</w:t>
             </w:r>
           </w:p>
           <w:p>
@@ -5469,7 +5519,7 @@
                 <w:color w:val="000000"/>
                 <w:sz w:val="21"/>
               </w:rPr>
-              <w:t>Robin creates a new native turn or session with an explicit context manifest and saves the synthesis as a task artifact.</w:t>
+              <w:t>Robin creates a new native turn or session with an explicit context manifest and saves the synthesis as a task artifact linked to that manifest and its input versions.</w:t>
             </w:r>
           </w:p>
         </w:tc>
@@ -5547,7 +5597,7 @@
                 <w:color w:val="000000"/>
                 <w:sz w:val="21"/>
               </w:rPr>
-              <w:t>P0</w:t>
+              <w:t>P1</w:t>
             </w:r>
           </w:p>
         </w:tc>
@@ -5614,7 +5664,7 @@
                 <w:color w:val="000000"/>
                 <w:sz w:val="21"/>
               </w:rPr>
-              <w:t>Context previews flag duplicate or derived artifacts and exclude them by default.</w:t>
+              <w:t>Context previews flag duplicate or derived artifacts and exclude them by default. In the MVP, the P0 context preview labels derived artifacts (FR-032); automatic lineage-based exclusion follows.</w:t>
             </w:r>
           </w:p>
         </w:tc>
@@ -5771,7 +5821,7 @@
                 <w:color w:val="000000"/>
                 <w:sz w:val="21"/>
               </w:rPr>
-              <w:t>Reach an active session or task within three primary interactions. Filters support project, task, runtime, and state; show freshness and partial coverage without invented progress percentages.</w:t>
+              <w:t>Reach an active session or task within three primary interactions (a click, activated control, or navigation selection). Filters support project, task, runtime, and state; show freshness and partial coverage without invented progress percentages.</w:t>
             </w:r>
           </w:p>
         </w:tc>
@@ -6065,7 +6115,7 @@
                 <w:color w:val="000000"/>
                 <w:sz w:val="21"/>
               </w:rPr>
-              <w:t>The MVP sends nothing until the user confirms that packet. Independent reviews do not receive one another's findings before an explicit sharing action.</w:t>
+              <w:t>The MVP sends nothing until the user confirms that packet. Robin never injects unselected findings, and unshared findings are never written inside a project or execution directory. Where a runtime cannot enforce that reviewers cannot read them, the capability report says so and the review is labeled not isolated. The preview labels syntheses and other derived artifacts so they are not mistaken for independent evidence.</w:t>
             </w:r>
           </w:p>
         </w:tc>
@@ -6212,7 +6262,7 @@
                 <w:color w:val="000000"/>
                 <w:sz w:val="21"/>
               </w:rPr>
-              <w:t>Notifications identify the task and session, avoid exposing sensitive payloads, and can be disabled. A notification does not itself mark task work complete.</w:t>
+              <w:t>Notifications identify the task and session, avoid exposing sensitive payloads, and can be disabled. A notification does not itself mark task work complete. The in-app attention queue (FR-035) is the P0 delivery mechanism.</w:t>
             </w:r>
           </w:p>
         </w:tc>
@@ -6617,7 +6667,7 @@
                 <w:color w:val="000000"/>
                 <w:sz w:val="21"/>
               </w:rPr>
-              <w:t>Do not duplicate history, resend prompts, or relaunch sessions. Mark stale connections and reconcile surviving runs; surface lost event coverage as a gap.</w:t>
+              <w:t>Do not duplicate history, resend prompts, or relaunch sessions. Mark stale connections and reconcile runs held by the session supervisor; surface lost event coverage as a gap.</w:t>
             </w:r>
           </w:p>
         </w:tc>
@@ -6753,7 +6803,7 @@
                 <w:color w:val="000000"/>
                 <w:sz w:val="21"/>
               </w:rPr>
-              <w:t>Use a validated native command or managed terminal session. Embedded browser terminals are optional; a full terminal emulator is not required for MVP.</w:t>
+              <w:t>Use a validated native command or managed terminal session. Each adapter declares attach, handoff, or unavailable while a managed run is active. Only one owner controls a session at a time: during handoff Robin disables its controls and pending requests, and control returns only after reconciliation. Embedded browser terminals are optional.</w:t>
             </w:r>
           </w:p>
         </w:tc>
@@ -7058,7 +7108,7 @@
                 <w:color w:val="000000"/>
                 <w:sz w:val="21"/>
               </w:rPr>
-              <w:t>Partial writes and unknown fields do not corrupt the index. Correlate sources, deduplicate events, and retain their original provenance.</w:t>
+              <w:t>Partial writes and unknown fields do not corrupt the index. Correlate sources, deduplicate events, and retain their original provenance. Installing harness hooks is opt-in, previewed, reversible, and never automatic.</w:t>
             </w:r>
           </w:p>
         </w:tc>
@@ -7204,6 +7254,151 @@
                 <w:sz w:val="21"/>
               </w:rPr>
               <w:t>Archived records remain searchable and can be restored.</w:t>
+            </w:r>
+          </w:p>
+        </w:tc>
+      </w:tr>
+    </w:tbl>
+    <w:p>
+      <w:pPr>
+        <w:spacing w:after="20"/>
+      </w:pPr>
+    </w:p>
+    <w:tbl>
+      <w:tblPr>
+        <w:tblStyle w:val="TableGrid"/>
+        <w:tblW w:type="dxa" w:w="9360"/>
+        <w:jc w:val="left"/>
+        <w:tblLayout w:type="fixed"/>
+        <w:tblLook w:firstColumn="1" w:firstRow="1" w:lastColumn="0" w:lastRow="0" w:noHBand="0" w:noVBand="1" w:val="04A0"/>
+        <w:tblInd w:w="120" w:type="dxa"/>
+        <w:tblBorders>
+          <w:top w:val="single" w:sz="4" w:color="D9D9D9"/>
+          <w:left w:val="single" w:sz="4" w:color="D9D9D9"/>
+          <w:bottom w:val="single" w:sz="4" w:color="D9D9D9"/>
+          <w:right w:val="single" w:sz="4" w:color="D9D9D9"/>
+          <w:insideH w:val="single" w:sz="4" w:color="D9D9D9"/>
+          <w:insideV w:val="single" w:sz="4" w:color="D9D9D9"/>
+        </w:tblBorders>
+      </w:tblPr>
+      <w:tblGrid>
+        <w:gridCol w:w="1600"/>
+        <w:gridCol w:w="7760"/>
+      </w:tblGrid>
+      <w:tr>
+        <w:trPr>
+          <w:cantSplit/>
+          <w:cantSplit/>
+        </w:trPr>
+        <w:tc>
+          <w:tcPr>
+            <w:tcW w:type="dxa" w:w="1600"/>
+            <w:tcMar>
+              <w:top w:w="75" w:type="dxa"/>
+              <w:start w:w="120" w:type="dxa"/>
+              <w:bottom w:w="75" w:type="dxa"/>
+              <w:end w:w="120" w:type="dxa"/>
+              <w:left w:w="90" w:type="dxa"/>
+              <w:right w:w="90" w:type="dxa"/>
+            </w:tcMar>
+            <w:vAlign w:val="center"/>
+            <w:shd w:fill="E8EDF4"/>
+          </w:tcPr>
+          <w:p>
+            <w:pPr>
+              <w:keepNext w:val="0"/>
+              <w:spacing w:after="60"/>
+            </w:pPr>
+            <w:r>
+              <w:rPr>
+                <w:rFonts w:ascii="Aptos" w:hAnsi="Aptos"/>
+                <w:b/>
+                <w:color w:val="000000"/>
+                <w:sz w:val="21"/>
+              </w:rPr>
+              <w:t>FR-043</w:t>
+            </w:r>
+          </w:p>
+          <w:p>
+            <w:pPr>
+              <w:keepNext w:val="0"/>
+              <w:spacing w:after="60"/>
+            </w:pPr>
+            <w:r>
+              <w:rPr>
+                <w:rFonts w:ascii="Aptos" w:hAnsi="Aptos"/>
+                <w:b/>
+                <w:color w:val="000000"/>
+                <w:sz w:val="21"/>
+              </w:rPr>
+              <w:t>P0</w:t>
+            </w:r>
+          </w:p>
+        </w:tc>
+        <w:tc>
+          <w:tcPr>
+            <w:tcW w:type="dxa" w:w="7760"/>
+            <w:tcMar>
+              <w:top w:w="75" w:type="dxa"/>
+              <w:start w:w="120" w:type="dxa"/>
+              <w:bottom w:w="75" w:type="dxa"/>
+              <w:end w:w="120" w:type="dxa"/>
+              <w:left w:w="90" w:type="dxa"/>
+              <w:right w:w="90" w:type="dxa"/>
+            </w:tcMar>
+            <w:vAlign w:val="center"/>
+            <w:shd w:fill="FFFFFF"/>
+          </w:tcPr>
+          <w:p>
+            <w:pPr>
+              <w:keepNext w:val="0"/>
+              <w:spacing w:after="60"/>
+            </w:pPr>
+            <w:r>
+              <w:rPr>
+                <w:rFonts w:ascii="Aptos" w:hAnsi="Aptos"/>
+                <w:b/>
+                <w:color w:val="000000"/>
+                <w:sz w:val="21"/>
+              </w:rPr>
+              <w:t>Backup and export</w:t>
+            </w:r>
+          </w:p>
+          <w:p>
+            <w:pPr>
+              <w:keepNext w:val="0"/>
+              <w:spacing w:after="60"/>
+            </w:pPr>
+            <w:r>
+              <w:rPr>
+                <w:rFonts w:ascii="Aptos" w:hAnsi="Aptos"/>
+                <w:color w:val="000000"/>
+                <w:sz w:val="21"/>
+              </w:rPr>
+              <w:t>The user can back up and export Robin metadata, task artifacts, finding versions, and context manifests.</w:t>
+            </w:r>
+          </w:p>
+          <w:p>
+            <w:pPr>
+              <w:keepNext w:val="0"/>
+              <w:spacing w:after="60"/>
+            </w:pPr>
+            <w:r>
+              <w:rPr>
+                <w:rFonts w:ascii="Aptos" w:hAnsi="Aptos"/>
+                <w:b/>
+                <w:color w:val="000000"/>
+                <w:sz w:val="21"/>
+              </w:rPr>
+              <w:t xml:space="preserve">Acceptance: </w:t>
+            </w:r>
+            <w:r>
+              <w:rPr>
+                <w:rFonts w:ascii="Aptos" w:hAnsi="Aptos"/>
+                <w:color w:val="000000"/>
+                <w:sz w:val="21"/>
+              </w:rPr>
+              <w:t>Backups are consistent with the database snapshot and restorable. Exports use relative paths and hashes, exclude credentials, and mark native sources as references rather than copies.</w:t>
             </w:r>
           </w:p>
         </w:tc>
@@ -7675,7 +7870,7 @@
           <w:color w:val="233044"/>
           <w:sz w:val="17"/>
         </w:rPr>
-        <w:t>robin task create prd-review --attach docs/PRD.md</w:t>
+        <w:t xml:space="preserve">robin task create prd-review --attach docs/PRD.md</w:t>
       </w:r>
       <w:r>
         <w:rPr>
@@ -7692,7 +7887,7 @@
           <w:color w:val="233044"/>
           <w:sz w:val="17"/>
         </w:rPr>
-        <w:t>robin run claude --task prd-review --prompt prompts/architecture-review.md</w:t>
+        <w:t xml:space="preserve">robin run claude --task prd-review --prompt prompts/architecture-review.md</w:t>
       </w:r>
       <w:r>
         <w:rPr>
@@ -7709,7 +7904,7 @@
           <w:color w:val="233044"/>
           <w:sz w:val="17"/>
         </w:rPr>
-        <w:t>robin run codex  --task prd-review --prompt prompts/implementation-review.md</w:t>
+        <w:t xml:space="preserve">robin run codex  --task prd-review --prompt prompts/implementation-review.md</w:t>
       </w:r>
       <w:r>
         <w:rPr>
@@ -7726,7 +7921,7 @@
           <w:color w:val="233044"/>
           <w:sz w:val="17"/>
         </w:rPr>
-        <w:t>robin run pi     --task prd-review --prompt prompts/requirements-review.md</w:t>
+        <w:t xml:space="preserve">robin run pi     --task prd-review --prompt prompts/requirements-review.md</w:t>
       </w:r>
       <w:r>
         <w:rPr>
@@ -7743,7 +7938,7 @@
           <w:color w:val="233044"/>
           <w:sz w:val="17"/>
         </w:rPr>
-        <w:t>robin synthesize --task prd-review --agent claude --from codex,pi</w:t>
+        <w:t xml:space="preserve">robin synthesize --task prd-review --agent claude --findings find_02,find_03</w:t>
       </w:r>
     </w:p>
     <w:p>
@@ -7850,7 +8045,7 @@
           <w:color w:val="233044"/>
           <w:sz w:val="17"/>
         </w:rPr>
-        <w:t>robin share finding codex:find_01 --to claude:session_42</w:t>
+        <w:t xml:space="preserve">robin share find_01 --to ses_42 \</w:t>
       </w:r>
       <w:r>
         <w:rPr>
@@ -7867,7 +8062,58 @@
           <w:color w:val="233044"/>
           <w:sz w:val="17"/>
         </w:rPr>
-        <w:t xml:space="preserve">  --prompt "Verify this finding against the PRD and repository. Explain any disagreement."</w:t>
+        <w:t xml:space="preserve">  --prompt "Verify this finding against the PRD and repository.</w:t>
+      </w:r>
+      <w:r>
+        <w:rPr>
+          <w:rFonts w:ascii="DejaVu Sans Mono" w:hAnsi="DejaVu Sans Mono"/>
+          <w:b w:val="0"/>
+          <w:sz w:val="17"/>
+        </w:rPr>
+        <w:br/>
+      </w:r>
+      <w:r>
+        <w:rPr>
+          <w:rFonts w:ascii="DejaVu Sans Mono" w:hAnsi="DejaVu Sans Mono"/>
+          <w:b w:val="0"/>
+          <w:color w:val="233044"/>
+          <w:sz w:val="17"/>
+        </w:rPr>
+        <w:t xml:space="preserve">            Explain any disagreement."</w:t>
+      </w:r>
+      <w:r>
+        <w:rPr>
+          <w:rFonts w:ascii="DejaVu Sans Mono" w:hAnsi="DejaVu Sans Mono"/>
+          <w:b w:val="0"/>
+          <w:sz w:val="17"/>
+        </w:rPr>
+        <w:br/>
+      </w:r>
+      <w:r>
+        <w:rPr>
+          <w:rFonts w:ascii="DejaVu Sans Mono" w:hAnsi="DejaVu Sans Mono"/>
+          <w:b w:val="0"/>
+          <w:color w:val="233044"/>
+          <w:sz w:val="17"/>
+        </w:rPr>
+        <w:t xml:space="preserve"># Prints the preview and asks to confirm. Non-interactive:</w:t>
+      </w:r>
+      <w:r>
+        <w:rPr>
+          <w:rFonts w:ascii="DejaVu Sans Mono" w:hAnsi="DejaVu Sans Mono"/>
+          <w:b w:val="0"/>
+          <w:sz w:val="17"/>
+        </w:rPr>
+        <w:br/>
+      </w:r>
+      <w:r>
+        <w:rPr>
+          <w:rFonts w:ascii="DejaVu Sans Mono" w:hAnsi="DejaVu Sans Mono"/>
+          <w:b w:val="0"/>
+          <w:color w:val="233044"/>
+          <w:sz w:val="17"/>
+        </w:rPr>
+        <w:t xml:space="preserve">#   robin context deliver PREVIEW --confirm HASH</w:t>
       </w:r>
     </w:p>
     <w:p>
@@ -7895,6 +8141,10 @@
     <w:p>
       <w:pPr>
         <w:keepLines/>
+        <w:numPr>
+          <w:ilvl w:val="0"/>
+          <w:numId w:val="16"/>
+        </w:numPr>
       </w:pPr>
       <w:r>
         <w:rPr>
@@ -7906,6 +8156,10 @@
     <w:p>
       <w:pPr>
         <w:keepLines/>
+        <w:numPr>
+          <w:ilvl w:val="0"/>
+          <w:numId w:val="16"/>
+        </w:numPr>
       </w:pPr>
       <w:r>
         <w:rPr>
@@ -7917,6 +8171,10 @@
     <w:p>
       <w:pPr>
         <w:keepLines/>
+        <w:numPr>
+          <w:ilvl w:val="0"/>
+          <w:numId w:val="16"/>
+        </w:numPr>
       </w:pPr>
       <w:r>
         <w:rPr>
@@ -7928,6 +8186,10 @@
     <w:p>
       <w:pPr>
         <w:keepLines/>
+        <w:numPr>
+          <w:ilvl w:val="0"/>
+          <w:numId w:val="16"/>
+        </w:numPr>
       </w:pPr>
       <w:r>
         <w:rPr>
@@ -7939,6 +8201,10 @@
     <w:p>
       <w:pPr>
         <w:keepLines/>
+        <w:numPr>
+          <w:ilvl w:val="0"/>
+          <w:numId w:val="16"/>
+        </w:numPr>
       </w:pPr>
       <w:r>
         <w:rPr>
@@ -9072,7 +9338,7 @@
                 <w:color w:val="000000"/>
                 <w:sz w:val="20"/>
               </w:rPr>
-              <w:t>id, project_id, title, objective, status</w:t>
+              <w:t>id, project_id, title, objective, status (open, completed, abandoned), archived</w:t>
             </w:r>
           </w:p>
         </w:tc>
@@ -9163,7 +9429,7 @@
                 <w:color w:val="000000"/>
                 <w:sz w:val="20"/>
               </w:rPr>
-              <w:t>id, runtime, native_id, mode, capabilities, state</w:t>
+              <w:t>id, runtime, native_id, mode, capabilities, state, control_owner</w:t>
             </w:r>
           </w:p>
         </w:tc>
@@ -9344,7 +9610,7 @@
                 <w:color w:val="000000"/>
                 <w:sz w:val="20"/>
               </w:rPr>
-              <w:t>id, task_id, author, summary, claims</w:t>
+              <w:t>id, version, task_id, author, created_at, summary, claims</w:t>
             </w:r>
           </w:p>
         </w:tc>
@@ -9373,7 +9639,7 @@
                 <w:color w:val="000000"/>
                 <w:sz w:val="20"/>
               </w:rPr>
-              <w:t>Structured artifact intended for cross-agent consumption.</w:t>
+              <w:t>Immutable versioned artifact for cross-agent consumption; author is a user or an agent session.</w:t>
             </w:r>
           </w:p>
         </w:tc>
@@ -9569,6 +9835,89 @@
         <w:tc>
           <w:tcPr>
             <w:tcW w:type="dxa" w:w="1550"/>
+            <w:vAlign w:val="center"/>
+            <w:tcMar>
+              <w:top w:w="75" w:type="dxa"/>
+              <w:bottom w:w="75" w:type="dxa"/>
+              <w:left w:w="90" w:type="dxa"/>
+              <w:right w:w="90" w:type="dxa"/>
+            </w:tcMar>
+            <w:shd w:fill="FFFFFF"/>
+          </w:tcPr>
+          <w:p>
+            <w:pPr>
+              <w:keepNext w:val="0"/>
+              <w:spacing w:after="60"/>
+            </w:pPr>
+            <w:r>
+              <w:rPr>
+                <w:color w:val="000000"/>
+                <w:sz w:val="20"/>
+              </w:rPr>
+              <w:t>Retrieval grant</w:t>
+            </w:r>
+          </w:p>
+        </w:tc>
+        <w:tc>
+          <w:tcPr>
+            <w:tcW w:type="dxa" w:w="3640"/>
+            <w:vAlign w:val="center"/>
+            <w:tcMar>
+              <w:top w:w="75" w:type="dxa"/>
+              <w:bottom w:w="75" w:type="dxa"/>
+              <w:left w:w="90" w:type="dxa"/>
+              <w:right w:w="90" w:type="dxa"/>
+            </w:tcMar>
+            <w:shd w:fill="FFFFFF"/>
+          </w:tcPr>
+          <w:p>
+            <w:pPr>
+              <w:keepNext w:val="0"/>
+              <w:spacing w:after="60"/>
+            </w:pPr>
+            <w:r>
+              <w:rPr>
+                <w:color w:val="000000"/>
+                <w:sz w:val="20"/>
+              </w:rPr>
+              <w:t>id, session_id, task_id, versions, ranges, approving action</w:t>
+            </w:r>
+          </w:p>
+        </w:tc>
+        <w:tc>
+          <w:tcPr>
+            <w:tcW w:type="dxa" w:w="4170"/>
+            <w:vAlign w:val="center"/>
+            <w:tcMar>
+              <w:top w:w="75" w:type="dxa"/>
+              <w:bottom w:w="75" w:type="dxa"/>
+              <w:left w:w="90" w:type="dxa"/>
+              <w:right w:w="90" w:type="dxa"/>
+            </w:tcMar>
+            <w:shd w:fill="FFFFFF"/>
+          </w:tcPr>
+          <w:p>
+            <w:pPr>
+              <w:keepNext w:val="0"/>
+              <w:spacing w:after="60"/>
+            </w:pPr>
+            <w:r>
+              <w:rPr>
+                <w:color w:val="000000"/>
+                <w:sz w:val="20"/>
+              </w:rPr>
+              <w:t>Revocable agent access to exact approved content.</w:t>
+            </w:r>
+          </w:p>
+        </w:tc>
+      </w:tr>
+      <w:tr>
+        <w:trPr>
+          <w:cantSplit/>
+        </w:trPr>
+        <w:tc>
+          <w:tcPr>
+            <w:tcW w:type="dxa" w:w="1550"/>
             <w:shd w:fill="FFFFFF"/>
             <w:tcMar>
               <w:top w:w="75" w:type="dxa"/>
@@ -9732,7 +10081,7 @@
                 <w:color w:val="000000"/>
                 <w:sz w:val="20"/>
               </w:rPr>
-              <w:t>One execution interval; ending a run does not complete the task.</w:t>
+              <w:t>One execution interval bound to one task at start; ending a run does not complete the task.</w:t>
             </w:r>
           </w:p>
         </w:tc>
@@ -9815,7 +10164,7 @@
                 <w:color w:val="000000"/>
                 <w:sz w:val="20"/>
               </w:rPr>
-              <w:t>Requested, submitted, acknowledged, or failed delivery.</w:t>
+              <w:t>Requested, submitted, acknowledged, failed, cancelled, or outcome_unknown.</w:t>
             </w:r>
           </w:p>
         </w:tc>
@@ -9872,7 +10221,7 @@
                 <w:color w:val="000000"/>
                 <w:sz w:val="20"/>
               </w:rPr>
-              <w:t>id, session_id, source_request, state</w:t>
+              <w:t>id, kind, session_id, task_id, native_request (optional), state</w:t>
             </w:r>
           </w:p>
         </w:tc>
@@ -9898,7 +10247,7 @@
                 <w:color w:val="000000"/>
                 <w:sz w:val="20"/>
               </w:rPr>
-              <w:t>Question, approval, failure, or findings awaiting review.</w:t>
+              <w:t>Question, approval, failure, or finding review; Robin-originated items have no native request.</w:t>
             </w:r>
           </w:p>
         </w:tc>
@@ -9999,7 +10348,7 @@
         <w:keepLines/>
       </w:pPr>
       <w:r>
-        <w:t>Task directory</w:t>
+        <w:t>Task artifact store</w:t>
       </w:r>
     </w:p>
     <w:p>
@@ -10014,7 +10363,7 @@
           <w:color w:val="233044"/>
           <w:sz w:val="17"/>
         </w:rPr>
-        <w:t>.robin/tasks/prd-review/</w:t>
+        <w:t xml:space="preserve"># Default: user app-data directory, outside every project and execution directory</w:t>
       </w:r>
       <w:r>
         <w:rPr>
@@ -10031,7 +10380,7 @@
           <w:color w:val="233044"/>
           <w:sz w:val="17"/>
         </w:rPr>
-        <w:t xml:space="preserve">  task.yaml</w:t>
+        <w:t xml:space="preserve">&lt;app-data&gt;/robin/tasks/prd-review/</w:t>
       </w:r>
       <w:r>
         <w:rPr>
@@ -10048,7 +10397,7 @@
           <w:color w:val="233044"/>
           <w:sz w:val="17"/>
         </w:rPr>
-        <w:t xml:space="preserve">  input/PRD.md</w:t>
+        <w:t xml:space="preserve">  task.json</w:t>
       </w:r>
       <w:r>
         <w:rPr>
@@ -10065,7 +10414,7 @@
           <w:color w:val="233044"/>
           <w:sz w:val="17"/>
         </w:rPr>
-        <w:t xml:space="preserve">  findings/claude-architecture.md</w:t>
+        <w:t xml:space="preserve">  input/PRD.md                  # approved snapshot</w:t>
       </w:r>
       <w:r>
         <w:rPr>
@@ -10082,7 +10431,7 @@
           <w:color w:val="233044"/>
           <w:sz w:val="17"/>
         </w:rPr>
-        <w:t xml:space="preserve">  findings/codex-implementation.md</w:t>
+        <w:t xml:space="preserve">  findings/find_01.v1.json</w:t>
       </w:r>
       <w:r>
         <w:rPr>
@@ -10099,7 +10448,7 @@
           <w:color w:val="233044"/>
           <w:sz w:val="17"/>
         </w:rPr>
-        <w:t xml:space="preserve">  findings/pi-requirements.md</w:t>
+        <w:t xml:space="preserve">  findings/find_02.v1.json</w:t>
       </w:r>
       <w:r>
         <w:rPr>
@@ -10135,6 +10484,23 @@
         </w:rPr>
         <w:t xml:space="preserve">  artifacts/final-synthesis.md</w:t>
       </w:r>
+      <w:r>
+        <w:rPr>
+          <w:rFonts w:ascii="DejaVu Sans Mono" w:hAnsi="DejaVu Sans Mono"/>
+          <w:b w:val="0"/>
+          <w:sz w:val="17"/>
+        </w:rPr>
+        <w:br/>
+      </w:r>
+      <w:r>
+        <w:rPr>
+          <w:rFonts w:ascii="DejaVu Sans Mono" w:hAnsi="DejaVu Sans Mono"/>
+          <w:b w:val="0"/>
+          <w:color w:val="233044"/>
+          <w:sz w:val="17"/>
+        </w:rPr>
+        <w:t xml:space="preserve"># A repository-visible .robin/ copy is created only by explicit export.</w:t>
+      </w:r>
     </w:p>
     <w:p>
       <w:pPr>
@@ -10158,7 +10524,7 @@
           <w:color w:val="233044"/>
           <w:sz w:val="17"/>
         </w:rPr>
-        <w:t>id: find_01</w:t>
+        <w:t xml:space="preserve"># Illustrative; the Technical Requirements (TR-060) own the schema.</w:t>
       </w:r>
       <w:r>
         <w:rPr>
@@ -10175,7 +10541,7 @@
           <w:color w:val="233044"/>
           <w:sz w:val="17"/>
         </w:rPr>
-        <w:t>task_id: prd-review</w:t>
+        <w:t xml:space="preserve">finding_id: find_01</w:t>
       </w:r>
       <w:r>
         <w:rPr>
@@ -10192,7 +10558,7 @@
           <w:color w:val="233044"/>
           <w:sz w:val="17"/>
         </w:rPr>
-        <w:t>author:</w:t>
+        <w:t xml:space="preserve">version: 1</w:t>
       </w:r>
       <w:r>
         <w:rPr>
@@ -10209,7 +10575,7 @@
           <w:color w:val="233044"/>
           <w:sz w:val="17"/>
         </w:rPr>
-        <w:t xml:space="preserve">  agent: codex</w:t>
+        <w:t xml:space="preserve">task_id: prd-review</w:t>
       </w:r>
       <w:r>
         <w:rPr>
@@ -10226,7 +10592,7 @@
           <w:color w:val="233044"/>
           <w:sz w:val="17"/>
         </w:rPr>
-        <w:t xml:space="preserve">  session_id: 019xyz</w:t>
+        <w:t xml:space="preserve">created_at: 2026-10-14T12:00:00Z</w:t>
       </w:r>
       <w:r>
         <w:rPr>
@@ -10243,7 +10609,7 @@
           <w:color w:val="233044"/>
           <w:sz w:val="17"/>
         </w:rPr>
-        <w:t>summary: "Authentication ownership is underspecified."</w:t>
+        <w:t xml:space="preserve">author: {kind: agent, runtime: codex, native_session_id: 019xyz, run_id: run_07}</w:t>
       </w:r>
       <w:r>
         <w:rPr>
@@ -10260,7 +10626,24 @@
           <w:color w:val="233044"/>
           <w:sz w:val="17"/>
         </w:rPr>
-        <w:t>claims:</w:t>
+        <w:t xml:space="preserve">summary: "Authentication ownership is underspecified."</w:t>
+      </w:r>
+      <w:r>
+        <w:rPr>
+          <w:rFonts w:ascii="DejaVu Sans Mono" w:hAnsi="DejaVu Sans Mono"/>
+          <w:b w:val="0"/>
+          <w:sz w:val="17"/>
+        </w:rPr>
+        <w:br/>
+      </w:r>
+      <w:r>
+        <w:rPr>
+          <w:rFonts w:ascii="DejaVu Sans Mono" w:hAnsi="DejaVu Sans Mono"/>
+          <w:b w:val="0"/>
+          <w:color w:val="233044"/>
+          <w:sz w:val="17"/>
+        </w:rPr>
+        <w:t xml:space="preserve">claims:</w:t>
       </w:r>
       <w:r>
         <w:rPr>
@@ -10294,7 +10677,7 @@
           <w:color w:val="233044"/>
           <w:sz w:val="17"/>
         </w:rPr>
-        <w:t xml:space="preserve">    evidence: ["docs/PRD.md#authentication"]</w:t>
+        <w:t xml:space="preserve">    evidence: [{artifact_id: src_01, range: "42-58"}]</w:t>
       </w:r>
       <w:r>
         <w:rPr>
@@ -10311,7 +10694,7 @@
           <w:color w:val="233044"/>
           <w:sz w:val="17"/>
         </w:rPr>
-        <w:t>recommendations:</w:t>
+        <w:t xml:space="preserve">recommendations:</w:t>
       </w:r>
       <w:r>
         <w:rPr>
@@ -10345,7 +10728,7 @@
           <w:color w:val="233044"/>
           <w:sz w:val="17"/>
         </w:rPr>
-        <w:t>questions:</w:t>
+        <w:t xml:space="preserve">questions:</w:t>
       </w:r>
       <w:r>
         <w:rPr>
@@ -10364,6 +10747,23 @@
         </w:rPr>
         <w:t xml:space="preserve">  - "Which service owns token refresh?"</w:t>
       </w:r>
+      <w:r>
+        <w:rPr>
+          <w:rFonts w:ascii="DejaVu Sans Mono" w:hAnsi="DejaVu Sans Mono"/>
+          <w:b w:val="0"/>
+          <w:sz w:val="17"/>
+        </w:rPr>
+        <w:br/>
+      </w:r>
+      <w:r>
+        <w:rPr>
+          <w:rFonts w:ascii="DejaVu Sans Mono" w:hAnsi="DejaVu Sans Mono"/>
+          <w:b w:val="0"/>
+          <w:color w:val="233044"/>
+          <w:sz w:val="17"/>
+        </w:rPr>
+        <w:t xml:space="preserve">parents: []</w:t>
+      </w:r>
     </w:p>
     <w:p>
       <w:pPr>
@@ -10376,6 +10776,17 @@
           <w:color w:val="000000"/>
         </w:rPr>
         <w:t>10  System design</w:t>
+      </w:r>
+    </w:p>
+    <w:p>
+      <w:pPr>
+        <w:keepLines/>
+      </w:pPr>
+      <w:r>
+        <w:rPr>
+          <w:b w:val="0"/>
+        </w:rPr>
+        <w:t>This section summarizes the design. The Technical Requirements document is authoritative for architecture, stack, storage layout, schemas, and APIs; where the two differ, it wins and this document is updated.</w:t>
       </w:r>
     </w:p>
     <w:p>
@@ -10700,7 +11111,64 @@
                 <w:color w:val="000000"/>
                 <w:sz w:val="20"/>
               </w:rPr>
-              <w:t>Supervises managed processes and SDK/protocol connections; reconciles sessions after reconnect.</w:t>
+              <w:t>Talks to the session supervisor, serializes session mutations, and reconciles sessions after reconnect.</w:t>
+            </w:r>
+          </w:p>
+        </w:tc>
+      </w:tr>
+      <w:tr>
+        <w:trPr>
+          <w:cantSplit/>
+        </w:trPr>
+        <w:tc>
+          <w:tcPr>
+            <w:tcW w:type="dxa" w:w="2200"/>
+            <w:vAlign w:val="center"/>
+            <w:tcMar>
+              <w:top w:w="75" w:type="dxa"/>
+              <w:bottom w:w="75" w:type="dxa"/>
+              <w:left w:w="90" w:type="dxa"/>
+              <w:right w:w="90" w:type="dxa"/>
+            </w:tcMar>
+            <w:shd w:fill="FFFFFF"/>
+          </w:tcPr>
+          <w:p>
+            <w:pPr>
+              <w:keepNext w:val="0"/>
+              <w:spacing w:after="60"/>
+            </w:pPr>
+            <w:r>
+              <w:rPr>
+                <w:color w:val="000000"/>
+                <w:sz w:val="20"/>
+              </w:rPr>
+              <w:t>Session supervisor</w:t>
+            </w:r>
+          </w:p>
+        </w:tc>
+        <w:tc>
+          <w:tcPr>
+            <w:tcW w:type="dxa" w:w="7160"/>
+            <w:vAlign w:val="center"/>
+            <w:tcMar>
+              <w:top w:w="75" w:type="dxa"/>
+              <w:bottom w:w="75" w:type="dxa"/>
+              <w:left w:w="90" w:type="dxa"/>
+              <w:right w:w="90" w:type="dxa"/>
+            </w:tcMar>
+            <w:shd w:fill="FFFFFF"/>
+          </w:tcPr>
+          <w:p>
+            <w:pPr>
+              <w:keepNext w:val="0"/>
+              <w:spacing w:after="60"/>
+            </w:pPr>
+            <w:r>
+              <w:rPr>
+                <w:color w:val="000000"/>
+                <w:sz w:val="20"/>
+              </w:rPr>
+              <w:t>Detached local process that owns managed runtime processes and SDK/protocol connections, buffers events, and survives application service restarts.</w:t>
             </w:r>
           </w:p>
         </w:tc>
@@ -11677,6 +12145,89 @@
                 <w:sz w:val="20"/>
               </w:rPr>
               <w:t>Prefer structured events and supported control over terminal scraping.</w:t>
+            </w:r>
+          </w:p>
+        </w:tc>
+      </w:tr>
+      <w:tr>
+        <w:trPr>
+          <w:cantSplit/>
+        </w:trPr>
+        <w:tc>
+          <w:tcPr>
+            <w:tcW w:type="dxa" w:w="1700"/>
+            <w:vAlign w:val="center"/>
+            <w:tcMar>
+              <w:top w:w="75" w:type="dxa"/>
+              <w:bottom w:w="75" w:type="dxa"/>
+              <w:left w:w="90" w:type="dxa"/>
+              <w:right w:w="90" w:type="dxa"/>
+            </w:tcMar>
+            <w:shd w:fill="FFFFFF"/>
+          </w:tcPr>
+          <w:p>
+            <w:pPr>
+              <w:keepNext w:val="0"/>
+              <w:spacing w:after="60"/>
+            </w:pPr>
+            <w:r>
+              <w:rPr>
+                <w:color w:val="000000"/>
+                <w:sz w:val="20"/>
+              </w:rPr>
+              <w:t>Session supervisor</w:t>
+            </w:r>
+          </w:p>
+        </w:tc>
+        <w:tc>
+          <w:tcPr>
+            <w:tcW w:type="dxa" w:w="2900"/>
+            <w:vAlign w:val="center"/>
+            <w:tcMar>
+              <w:top w:w="75" w:type="dxa"/>
+              <w:bottom w:w="75" w:type="dxa"/>
+              <w:left w:w="90" w:type="dxa"/>
+              <w:right w:w="90" w:type="dxa"/>
+            </w:tcMar>
+            <w:shd w:fill="FFFFFF"/>
+          </w:tcPr>
+          <w:p>
+            <w:pPr>
+              <w:keepNext w:val="0"/>
+              <w:spacing w:after="60"/>
+            </w:pPr>
+            <w:r>
+              <w:rPr>
+                <w:color w:val="000000"/>
+                <w:sz w:val="20"/>
+              </w:rPr>
+              <w:t>Detached local process</w:t>
+            </w:r>
+          </w:p>
+        </w:tc>
+        <w:tc>
+          <w:tcPr>
+            <w:tcW w:type="dxa" w:w="4760"/>
+            <w:vAlign w:val="center"/>
+            <w:tcMar>
+              <w:top w:w="75" w:type="dxa"/>
+              <w:bottom w:w="75" w:type="dxa"/>
+              <w:left w:w="90" w:type="dxa"/>
+              <w:right w:w="90" w:type="dxa"/>
+            </w:tcMar>
+            <w:shd w:fill="FFFFFF"/>
+          </w:tcPr>
+          <w:p>
+            <w:pPr>
+              <w:keepNext w:val="0"/>
+              <w:spacing w:after="60"/>
+            </w:pPr>
+            <w:r>
+              <w:rPr>
+                <w:color w:val="000000"/>
+                <w:sz w:val="20"/>
+              </w:rPr>
+              <w:t>Proposed: keeps managed sessions alive across service restarts; tmux is a fallback where a runtime requires a terminal.</w:t>
             </w:r>
           </w:p>
         </w:tc>
@@ -12355,7 +12906,7 @@
                 <w:color w:val="000000"/>
                 <w:sz w:val="20"/>
               </w:rPr>
-              <w:t>Search normalized session events using bounded results.</w:t>
+              <w:t>Search events of sessions granted to the task using bounded results.</w:t>
             </w:r>
           </w:p>
         </w:tc>
@@ -12481,7 +13032,7 @@
                 <w:color w:val="000000"/>
                 <w:sz w:val="20"/>
               </w:rPr>
-              <w:t>Publish a structured finding linked to the calling session.</w:t>
+              <w:t>Publish a structured finding attributed to the calling session's launch identity.</w:t>
             </w:r>
           </w:p>
         </w:tc>
@@ -12572,7 +13123,7 @@
         <w:rPr>
           <w:b w:val="0"/>
         </w:rPr>
-        <w:t>Validate Codex app-server for persistent sessions, events, and approvals; Claude Agent SDK for programmatic Claude Code execution; and Pi RPC or its SDK behind a local sidecar. These are integration candidates based on current public documentation, not a claim that Robin has implemented or validated them. Phase 0 must verify exact versions, authentication, control behavior, session compatibility, and event coverage. See Appendix C.</w:t>
+        <w:t>Validate Codex app-server for persistent sessions, events, and approvals; Claude Agent SDK for programmatic Claude Code execution; and Pi RPC, or its SDK behind a local sidecar. Phase 0 also validates how each transport runs under the session supervisor. These are integration candidates based on current public documentation, not a claim that Robin has implemented or validated them. Phase 0 must verify exact versions, authentication, control behavior, session compatibility, and event coverage. See Appendix C.</w:t>
       </w:r>
     </w:p>
     <w:p>
@@ -12719,7 +13270,7 @@
           <w:color w:val="202733"/>
           <w:sz w:val="21"/>
         </w:rPr>
-        <w:t>Every context transfer creates an immutable manifest with target agent/session, source IDs and hashes, excerpt boundaries, redactions, estimated size, time, and initiating user action. Record delivery as prepared, submitted, acknowledged, or failed. A submitted packet alone does not prove the target consumed it; link any supported acknowledgement and resulting findings.</w:t>
+        <w:t>Every context transfer creates an immutable manifest with target agent/session, source IDs and hashes, excerpt boundaries, redactions, estimated size, time, and initiating user action. Record delivery as prepared, submitted, acknowledged, failed, or outcome_unknown; an unknown outcome is reconciled, never resent automatically. A submitted packet alone does not prove the target consumed it; link any supported acknowledgement and resulting findings. Agent retrievals through a grant also create a manifest.</w:t>
       </w:r>
     </w:p>
     <w:p>
@@ -12886,7 +13437,43 @@
           <w:color w:val="202733"/>
           <w:sz w:val="21"/>
         </w:rPr>
-        <w:t>Context packets are scanned for configurable secret patterns before sharing.</w:t>
+        <w:t>Context packets are scanned for configurable secret patterns before sharing; indexed transcripts are scanned at index time and matches are masked in search results and snippets.</w:t>
+      </w:r>
+    </w:p>
+    <w:p>
+      <w:pPr>
+        <w:keepLines/>
+        <w:numPr>
+          <w:ilvl w:val="0"/>
+          <w:numId w:val="19"/>
+        </w:numPr>
+        <w:spacing w:after="80" w:line="264" w:lineRule="auto"/>
+      </w:pPr>
+      <w:r>
+        <w:rPr>
+          <w:rFonts w:ascii="Aptos" w:hAnsi="Aptos"/>
+          <w:color w:val="202733"/>
+          <w:sz w:val="21"/>
+        </w:rPr>
+        <w:t>Shared findings and excerpts are framed to the target agent as quoted data with source labels, not as instructions; the preview flags excerpts that contain tool or web output.</w:t>
+      </w:r>
+    </w:p>
+    <w:p>
+      <w:pPr>
+        <w:keepLines/>
+        <w:numPr>
+          <w:ilvl w:val="0"/>
+          <w:numId w:val="19"/>
+        </w:numPr>
+        <w:spacing w:after="80" w:line="264" w:lineRule="auto"/>
+      </w:pPr>
+      <w:r>
+        <w:rPr>
+          <w:rFonts w:ascii="Aptos" w:hAnsi="Aptos"/>
+          <w:color w:val="202733"/>
+          <w:sz w:val="21"/>
+        </w:rPr>
+        <w:t>Robin does not change harness configuration silently. Installing hooks for observed sessions is opt-in, previewed, reversible, and never automatic.</w:t>
       </w:r>
     </w:p>
     <w:p>
@@ -12964,6 +13551,10 @@
     <w:p>
       <w:pPr>
         <w:keepLines/>
+        <w:numPr>
+          <w:ilvl w:val="0"/>
+          <w:numId w:val="19"/>
+        </w:numPr>
       </w:pPr>
       <w:r>
         <w:rPr>
@@ -12975,6 +13566,10 @@
     <w:p>
       <w:pPr>
         <w:keepLines/>
+        <w:numPr>
+          <w:ilvl w:val="0"/>
+          <w:numId w:val="19"/>
+        </w:numPr>
       </w:pPr>
       <w:r>
         <w:rPr>
@@ -12993,7 +13588,7 @@
         <w:rPr>
           <w:color w:val="000000"/>
         </w:rPr>
-        <w:t>13  Non functional requirements</w:t>
+        <w:t xml:space="preserve">13  Non-functional requirements</w:t>
       </w:r>
     </w:p>
     <w:tbl>
@@ -13203,7 +13798,7 @@
                 <w:color w:val="000000"/>
                 <w:sz w:val="20"/>
               </w:rPr>
-              <w:t>Dashboard interactive within 2 seconds for 10,000 indexed sessions on reference hardware.</w:t>
+              <w:t>First usable dashboard snapshot within 2 seconds of service start, with 10,000 indexed sessions, on reference hardware.</w:t>
             </w:r>
           </w:p>
         </w:tc>
@@ -13295,7 +13890,7 @@
                 <w:color w:val="000000"/>
                 <w:sz w:val="20"/>
               </w:rPr>
-              <w:t>Typical full-text query returns first results within 300 ms.</w:t>
+              <w:t>Typical full-text query returns first results within 300 ms on the NFR-01 reference dataset.</w:t>
             </w:r>
           </w:p>
         </w:tc>
@@ -13663,7 +14258,7 @@
                 <w:color w:val="000000"/>
                 <w:sz w:val="20"/>
               </w:rPr>
-              <w:t>An unsupported agent version degrades only its adapter and surfaces a clear warning.</w:t>
+              <w:t>An unsupported agent version degrades only its adapter; the dashboard shows a degraded state with robin doctor guidance.</w:t>
             </w:r>
           </w:p>
         </w:tc>
@@ -14341,7 +14936,7 @@
                 <w:color w:val="000000"/>
                 <w:sz w:val="20"/>
               </w:rPr>
-              <w:t>At least 90% of sessions from validated agent versions can be opened and, where supported, resumed.</w:t>
+              <w:t>At least 90% of sessions in the Phase 0 corpus for each validated runtime version can be opened and, where supported, resumed.</w:t>
             </w:r>
           </w:p>
         </w:tc>
@@ -14416,6 +15011,63 @@
         <w:tc>
           <w:tcPr>
             <w:tcW w:type="dxa" w:w="3000"/>
+            <w:vAlign w:val="center"/>
+            <w:tcMar>
+              <w:top w:w="75" w:type="dxa"/>
+              <w:bottom w:w="75" w:type="dxa"/>
+              <w:left w:w="90" w:type="dxa"/>
+              <w:right w:w="90" w:type="dxa"/>
+            </w:tcMar>
+            <w:shd w:fill="FFFFFF"/>
+          </w:tcPr>
+          <w:p>
+            <w:pPr>
+              <w:keepNext w:val="0"/>
+              <w:spacing w:after="60"/>
+            </w:pPr>
+            <w:r>
+              <w:rPr>
+                <w:color w:val="000000"/>
+                <w:sz w:val="20"/>
+              </w:rPr>
+              <w:t>Time to cross-agent review</w:t>
+            </w:r>
+          </w:p>
+        </w:tc>
+        <w:tc>
+          <w:tcPr>
+            <w:tcW w:type="dxa" w:w="6360"/>
+            <w:vAlign w:val="center"/>
+            <w:tcMar>
+              <w:top w:w="75" w:type="dxa"/>
+              <w:bottom w:w="75" w:type="dxa"/>
+              <w:left w:w="90" w:type="dxa"/>
+              <w:right w:w="90" w:type="dxa"/>
+            </w:tcMar>
+            <w:shd w:fill="FFFFFF"/>
+          </w:tcPr>
+          <w:p>
+            <w:pPr>
+              <w:keepNext w:val="0"/>
+              <w:spacing w:after="60"/>
+            </w:pPr>
+            <w:r>
+              <w:rPr>
+                <w:color w:val="000000"/>
+                <w:sz w:val="20"/>
+              </w:rPr>
+              <w:t>Getting a second agent's review of selected findings takes less time than the copy-and-paste baseline recorded in Phase 0.</w:t>
+            </w:r>
+          </w:p>
+        </w:tc>
+      </w:tr>
+      <w:tr>
+        <w:trPr>
+          <w:cantSplit/>
+        </w:trPr>
+        <w:tc>
+          <w:tcPr>
+            <w:tcW w:type="dxa" w:w="3000"/>
             <w:shd w:fill="FFFFFF"/>
             <w:tcMar>
               <w:top w:w="75" w:type="dxa"/>
@@ -14530,7 +15182,7 @@
                 <w:color w:val="000000"/>
                 <w:sz w:val="20"/>
               </w:rPr>
-              <w:t>Default findings-first packets are materially smaller than the complete source transcripts.</w:t>
+              <w:t>Proposed: default findings-first packets in the acceptance scenario are at most 25% of the bytes of the complete source transcripts.</w:t>
             </w:r>
           </w:p>
         </w:tc>
@@ -14765,6 +15417,120 @@
                 <w:sz w:val="20"/>
               </w:rPr>
               <w:t>No unconfirmed context transfer, duplicate prompt, or auto-approved request in recovery tests.</w:t>
+            </w:r>
+          </w:p>
+        </w:tc>
+      </w:tr>
+      <w:tr>
+        <w:trPr>
+          <w:cantSplit/>
+        </w:trPr>
+        <w:tc>
+          <w:tcPr>
+            <w:tcW w:type="dxa" w:w="3000"/>
+            <w:vAlign w:val="center"/>
+            <w:tcMar>
+              <w:top w:w="75" w:type="dxa"/>
+              <w:bottom w:w="75" w:type="dxa"/>
+              <w:left w:w="90" w:type="dxa"/>
+              <w:right w:w="90" w:type="dxa"/>
+            </w:tcMar>
+            <w:shd w:fill="FFFFFF"/>
+          </w:tcPr>
+          <w:p>
+            <w:pPr>
+              <w:keepNext w:val="0"/>
+              <w:spacing w:after="60"/>
+            </w:pPr>
+            <w:r>
+              <w:rPr>
+                <w:color w:val="000000"/>
+                <w:sz w:val="20"/>
+              </w:rPr>
+              <w:t>Restart continuity</w:t>
+            </w:r>
+          </w:p>
+        </w:tc>
+        <w:tc>
+          <w:tcPr>
+            <w:tcW w:type="dxa" w:w="6360"/>
+            <w:vAlign w:val="center"/>
+            <w:tcMar>
+              <w:top w:w="75" w:type="dxa"/>
+              <w:bottom w:w="75" w:type="dxa"/>
+              <w:left w:w="90" w:type="dxa"/>
+              <w:right w:w="90" w:type="dxa"/>
+            </w:tcMar>
+            <w:shd w:fill="FFFFFF"/>
+          </w:tcPr>
+          <w:p>
+            <w:pPr>
+              <w:keepNext w:val="0"/>
+              <w:spacing w:after="60"/>
+            </w:pPr>
+            <w:r>
+              <w:rPr>
+                <w:color w:val="000000"/>
+                <w:sz w:val="20"/>
+              </w:rPr>
+              <w:t>Managed sessions keep running through a Robin service restart and reconnect without relaunch or repeated input.</w:t>
+            </w:r>
+          </w:p>
+        </w:tc>
+      </w:tr>
+      <w:tr>
+        <w:trPr>
+          <w:cantSplit/>
+        </w:trPr>
+        <w:tc>
+          <w:tcPr>
+            <w:tcW w:type="dxa" w:w="3000"/>
+            <w:vAlign w:val="center"/>
+            <w:tcMar>
+              <w:top w:w="75" w:type="dxa"/>
+              <w:bottom w:w="75" w:type="dxa"/>
+              <w:left w:w="90" w:type="dxa"/>
+              <w:right w:w="90" w:type="dxa"/>
+            </w:tcMar>
+            <w:shd w:fill="FFFFFF"/>
+          </w:tcPr>
+          <w:p>
+            <w:pPr>
+              <w:keepNext w:val="0"/>
+              <w:spacing w:after="60"/>
+            </w:pPr>
+            <w:r>
+              <w:rPr>
+                <w:color w:val="000000"/>
+                <w:sz w:val="20"/>
+              </w:rPr>
+              <w:t>Review independence</w:t>
+            </w:r>
+          </w:p>
+        </w:tc>
+        <w:tc>
+          <w:tcPr>
+            <w:tcW w:type="dxa" w:w="6360"/>
+            <w:vAlign w:val="center"/>
+            <w:tcMar>
+              <w:top w:w="75" w:type="dxa"/>
+              <w:bottom w:w="75" w:type="dxa"/>
+              <w:left w:w="90" w:type="dxa"/>
+              <w:right w:w="90" w:type="dxa"/>
+            </w:tcMar>
+            <w:shd w:fill="FFFFFF"/>
+          </w:tcPr>
+          <w:p>
+            <w:pPr>
+              <w:keepNext w:val="0"/>
+              <w:spacing w:after="60"/>
+            </w:pPr>
+            <w:r>
+              <w:rPr>
+                <w:color w:val="000000"/>
+                <w:sz w:val="20"/>
+              </w:rPr>
+              <w:t>In the acceptance scenario no reviewer reads another reviewer's unshared finding where the capability report claims isolation.</w:t>
             </w:r>
           </w:p>
         </w:tc>
@@ -14798,7 +15564,7 @@
           <w:color w:val="202733"/>
           <w:sz w:val="21"/>
         </w:rPr>
-        <w:t>The MVP is accepted when the following end-to-end scenario succeeds on a clean supported macOS environment. Adapter validation also covers Linux. Fixtures test event edge cases; real installed harness runs verify live control.</w:t>
+        <w:t>The MVP is accepted when the following end-to-end scenario succeeds on a clean supported macOS environment. Adapter validation also covers Linux. Fixtures test event edge cases; real installed harness runs verify live control. Steps that need live control apply to each runtime that meets the capability floor; an observed-only runtime completes the history and search steps.</w:t>
       </w:r>
     </w:p>
     <w:p>
@@ -14888,7 +15654,7 @@
           <w:color w:val="202733"/>
           <w:sz w:val="21"/>
         </w:rPr>
-        <w:t>Observe structured activity, respond to a supported question or approval request, and collect one attributed finding from each agent.</w:t>
+        <w:t>Observe structured activity, respond to a supported question or approval request, and collect one attributed finding from each agent through its validated publication path, with MCP disabled for at least one run.</w:t>
       </w:r>
     </w:p>
     <w:p>
@@ -14978,12 +15744,29 @@
           <w:color w:val="202733"/>
           <w:sz w:val="21"/>
         </w:rPr>
-        <w:t>Restart Robin, reconcile any surviving sessions without relaunching them, and verify persistent task links, findings, manifests, activity history, and search results.</w:t>
+        <w:t>Restart the Robin service while managed sessions run; the supervisor keeps them alive and Robin reconciles them without relaunch. Verify persistent task links, findings, manifests, activity history, and search results.</w:t>
       </w:r>
     </w:p>
     <w:p>
       <w:pPr>
         <w:keepLines/>
+      </w:pPr>
+      <w:r>
+        <w:rPr>
+          <w:rFonts w:ascii="Aptos" w:hAnsi="Aptos"/>
+          <w:color w:val="202733"/>
+          <w:sz w:val="21"/>
+        </w:rPr>
+        <w:t>Also verify:</w:t>
+      </w:r>
+    </w:p>
+    <w:p>
+      <w:pPr>
+        <w:keepLines/>
+        <w:numPr>
+          <w:ilvl w:val="0"/>
+          <w:numId w:val="19"/>
+        </w:numPr>
       </w:pPr>
       <w:r>
         <w:rPr>
@@ -14995,6 +15778,10 @@
     <w:p>
       <w:pPr>
         <w:keepLines/>
+        <w:numPr>
+          <w:ilvl w:val="0"/>
+          <w:numId w:val="19"/>
+        </w:numPr>
       </w:pPr>
       <w:r>
         <w:rPr>
@@ -15006,12 +15793,91 @@
     <w:p>
       <w:pPr>
         <w:keepLines/>
+        <w:numPr>
+          <w:ilvl w:val="0"/>
+          <w:numId w:val="19"/>
+        </w:numPr>
       </w:pPr>
       <w:r>
         <w:rPr>
           <w:b w:val="0"/>
         </w:rPr>
         <w:t>Refresh or close the browser while work runs. Reopening the workspace preserves the session without relaunch or unintended termination.</w:t>
+      </w:r>
+    </w:p>
+    <w:p>
+      <w:pPr>
+        <w:keepLines/>
+        <w:numPr>
+          <w:ilvl w:val="0"/>
+          <w:numId w:val="19"/>
+        </w:numPr>
+      </w:pPr>
+      <w:r>
+        <w:rPr>
+          <w:b w:val="0"/>
+        </w:rPr>
+        <w:t>Publish a finding from one reviewer while another runs; confirm the reported independence boundary holds before and after an approved transfer.</w:t>
+      </w:r>
+    </w:p>
+    <w:p>
+      <w:pPr>
+        <w:keepLines/>
+        <w:numPr>
+          <w:ilvl w:val="0"/>
+          <w:numId w:val="19"/>
+        </w:numPr>
+      </w:pPr>
+      <w:r>
+        <w:rPr>
+          <w:b w:val="0"/>
+        </w:rPr>
+        <w:t>Open the native terminal during an active turn and during a pending approval; confirm there is never a second active owner or a duplicate response.</w:t>
+      </w:r>
+    </w:p>
+    <w:p>
+      <w:pPr>
+        <w:keepLines/>
+        <w:numPr>
+          <w:ilvl w:val="0"/>
+          <w:numId w:val="19"/>
+        </w:numPr>
+      </w:pPr>
+      <w:r>
+        <w:rPr>
+          <w:b w:val="0"/>
+        </w:rPr>
+        <w:t>Attach a session to a second task; confirm a new native session is the default and late events keep their original task.</w:t>
+      </w:r>
+    </w:p>
+    <w:p>
+      <w:pPr>
+        <w:keepLines/>
+        <w:numPr>
+          <w:ilvl w:val="0"/>
+          <w:numId w:val="19"/>
+        </w:numPr>
+      </w:pPr>
+      <w:r>
+        <w:rPr>
+          <w:b w:val="0"/>
+        </w:rPr>
+        <w:t>Stop the session supervisor itself; confirm affected sessions show disconnected, nothing relaunches automatically, and native resume is offered.</w:t>
+      </w:r>
+    </w:p>
+    <w:p>
+      <w:pPr>
+        <w:keepLines/>
+        <w:numPr>
+          <w:ilvl w:val="0"/>
+          <w:numId w:val="19"/>
+        </w:numPr>
+      </w:pPr>
+      <w:r>
+        <w:rPr>
+          <w:b w:val="0"/>
+        </w:rPr>
+        <w:t>Back up and export a task, then restore it into a clean data directory; confirm findings, manifests, and hashes match.</w:t>
       </w:r>
     </w:p>
     <w:p>
@@ -15199,7 +16065,7 @@
                 <w:color w:val="000000"/>
                 <w:sz w:val="20"/>
               </w:rPr>
-              <w:t>Test launch, resume, events, authentication, messaging, interruption, and approvals for each runtime.</w:t>
+              <w:t>Test launch, resume, events, authentication and subscription credentials, messaging, interruption, approvals, terminal ownership, finding publication, and supervisor hosting for each runtime.</w:t>
             </w:r>
           </w:p>
         </w:tc>
@@ -15225,7 +16091,7 @@
                 <w:color w:val="000000"/>
                 <w:sz w:val="20"/>
               </w:rPr>
-              <w:t>Capability matrix and live evidence for all three integrations; unresolved gaps documented.</w:t>
+              <w:t>Capability matrix with live evidence; each runtime classified as live (meets the floor) or observed-only; supervisor transport plan; unresolved gaps documented.</w:t>
             </w:r>
           </w:p>
         </w:tc>
@@ -15282,7 +16148,7 @@
                 <w:color w:val="000000"/>
                 <w:sz w:val="20"/>
               </w:rPr>
-              <w:t>Local API, one adapter, persistent actions/events, browser session card and activity feed.</w:t>
+              <w:t>Local API, session supervisor, one adapter, persistent actions/events, browser session card and activity feed.</w:t>
             </w:r>
           </w:p>
         </w:tc>
@@ -15308,7 +16174,7 @@
                 <w:color w:val="000000"/>
                 <w:sz w:val="20"/>
               </w:rPr>
-              <w:t>Launch, observe, send a follow-up, interrupt, and reconnect safely.</w:t>
+              <w:t>Launch, observe, send a follow-up, interrupt, reconnect safely, and survive a service restart.</w:t>
             </w:r>
           </w:p>
         </w:tc>
@@ -15365,7 +16231,7 @@
                 <w:color w:val="000000"/>
                 <w:sz w:val="20"/>
               </w:rPr>
-              <w:t>Projects/tasks, all three adapters, attention queue, native terminal access, state reconciliation.</w:t>
+              <w:t>Projects/tasks, all adapters at their Phase 0 level, attention queue, native terminal access, state reconciliation.</w:t>
             </w:r>
           </w:p>
         </w:tc>
@@ -15531,7 +16397,7 @@
                 <w:color w:val="000000"/>
                 <w:sz w:val="20"/>
               </w:rPr>
-              <w:t>Search, historical indexing, retention, packaging, OS checks, accessibility, and security.</w:t>
+              <w:t>Search, historical indexing, retention, backup and export, packaging, OS checks, accessibility, and security.</w:t>
             </w:r>
           </w:p>
         </w:tc>
@@ -15672,7 +16538,7 @@
           <w:color w:val="202733"/>
           <w:sz w:val="21"/>
         </w:rPr>
-        <w:t>Start with one complete managed-session workflow: launch an agent, receive events, show live activity, send a follow-up, and interrupt safely. Establish the shared task and event model, then extend the adapters to all three runtimes. Add selective findings exchange and search. A passive history browser alone does not satisfy this MVP.</w:t>
+        <w:t>Start with one complete managed-session workflow under the session supervisor: launch an agent, receive events, show live activity, send a follow-up, interrupt safely, and restart the service without losing the session. Establish the shared task and event model, then extend the adapters to every runtime. Add selective findings exchange and search. A passive history browser alone does not satisfy this MVP.</w:t>
       </w:r>
       <w:commentRangeEnd w:id="2"/>
       <w:r>
@@ -15680,6 +16546,29 @@
           <w:rStyle w:val="CommentReference"/>
         </w:rPr>
         <w:commentReference w:id="2"/>
+      </w:r>
+    </w:p>
+    <w:p>
+      <w:pPr>
+        <w:pStyle w:val="Heading2"/>
+        <w:keepNext/>
+        <w:keepLines/>
+      </w:pPr>
+      <w:r>
+        <w:t>Minimum capability floor</w:t>
+      </w:r>
+    </w:p>
+    <w:p>
+      <w:pPr>
+        <w:keepLines/>
+      </w:pPr>
+      <w:r>
+        <w:rPr>
+          <w:rFonts w:ascii="Aptos" w:hAnsi="Aptos"/>
+          <w:color w:val="202733"/>
+          <w:sz w:val="21"/>
+        </w:rPr>
+        <w:t>A runtime ships with live control only if Phase 0 proves all of the following with real runs: launch with native ID capture, structured event streaming, a follow-up message, interruption, approval response or a working native fallback, one validated finding publication path, and hosting under the session supervisor. A runtime that misses the floor ships observed-only: discovery, history, search, and native terminal launch, with live controls disabled and the reason shown. The release record names each runtime's level. Live control for an observed-only runtime is a follow-up release.</w:t>
       </w:r>
     </w:p>
     <w:p>
@@ -16098,6 +16987,89 @@
         <w:tc>
           <w:tcPr>
             <w:tcW w:type="dxa" w:w="2500"/>
+            <w:vAlign w:val="center"/>
+            <w:tcMar>
+              <w:top w:w="75" w:type="dxa"/>
+              <w:bottom w:w="75" w:type="dxa"/>
+              <w:left w:w="90" w:type="dxa"/>
+              <w:right w:w="90" w:type="dxa"/>
+            </w:tcMar>
+            <w:shd w:fill="FFFFFF"/>
+          </w:tcPr>
+          <w:p>
+            <w:pPr>
+              <w:keepNext w:val="0"/>
+              <w:spacing w:after="60"/>
+            </w:pPr>
+            <w:r>
+              <w:rPr>
+                <w:color w:val="000000"/>
+                <w:sz w:val="20"/>
+              </w:rPr>
+              <w:t>Prompt injection</w:t>
+            </w:r>
+          </w:p>
+        </w:tc>
+        <w:tc>
+          <w:tcPr>
+            <w:tcW w:type="dxa" w:w="3030"/>
+            <w:vAlign w:val="center"/>
+            <w:tcMar>
+              <w:top w:w="75" w:type="dxa"/>
+              <w:bottom w:w="75" w:type="dxa"/>
+              <w:left w:w="90" w:type="dxa"/>
+              <w:right w:w="90" w:type="dxa"/>
+            </w:tcMar>
+            <w:shd w:fill="FFFFFF"/>
+          </w:tcPr>
+          <w:p>
+            <w:pPr>
+              <w:keepNext w:val="0"/>
+              <w:spacing w:after="60"/>
+            </w:pPr>
+            <w:r>
+              <w:rPr>
+                <w:color w:val="000000"/>
+                <w:sz w:val="20"/>
+              </w:rPr>
+              <w:t>Shared tool or web output steers the target agent.</w:t>
+            </w:r>
+          </w:p>
+        </w:tc>
+        <w:tc>
+          <w:tcPr>
+            <w:tcW w:type="dxa" w:w="3830"/>
+            <w:vAlign w:val="center"/>
+            <w:tcMar>
+              <w:top w:w="75" w:type="dxa"/>
+              <w:bottom w:w="75" w:type="dxa"/>
+              <w:left w:w="90" w:type="dxa"/>
+              <w:right w:w="90" w:type="dxa"/>
+            </w:tcMar>
+            <w:shd w:fill="FFFFFF"/>
+          </w:tcPr>
+          <w:p>
+            <w:pPr>
+              <w:keepNext w:val="0"/>
+              <w:spacing w:after="60"/>
+            </w:pPr>
+            <w:r>
+              <w:rPr>
+                <w:color w:val="000000"/>
+                <w:sz w:val="20"/>
+              </w:rPr>
+              <w:t>Quoted-data framing, source labels, and preview flags for tool and web content.</w:t>
+            </w:r>
+          </w:p>
+        </w:tc>
+      </w:tr>
+      <w:tr>
+        <w:trPr>
+          <w:cantSplit/>
+        </w:trPr>
+        <w:tc>
+          <w:tcPr>
+            <w:tcW w:type="dxa" w:w="2500"/>
             <w:shd w:fill="FFFFFF"/>
             <w:tcMar>
               <w:top w:w="75" w:type="dxa"/>
@@ -16567,7 +17539,7 @@
                 <w:color w:val="000000"/>
                 <w:sz w:val="20"/>
               </w:rPr>
-              <w:t>Duplicate actions</w:t>
+              <w:t>Weakest adapter</w:t>
             </w:r>
           </w:p>
         </w:tc>
@@ -16593,7 +17565,7 @@
                 <w:color w:val="000000"/>
                 <w:sz w:val="20"/>
               </w:rPr>
-              <w:t>Reconnect or retry could send the same prompt twice.</w:t>
+              <w:t>One runtime failing Phase 0 blocks the whole release.</w:t>
             </w:r>
           </w:p>
         </w:tc>
@@ -16619,7 +17591,173 @@
                 <w:color w:val="000000"/>
                 <w:sz w:val="20"/>
               </w:rPr>
+              <w:t>Minimum capability floor; a runtime that misses it ships observed-only and the release record says so.</w:t>
+            </w:r>
+          </w:p>
+        </w:tc>
+      </w:tr>
+      <w:tr>
+        <w:trPr>
+          <w:cantSplit/>
+        </w:trPr>
+        <w:tc>
+          <w:tcPr>
+            <w:tcW w:type="dxa" w:w="2500"/>
+            <w:vAlign w:val="center"/>
+            <w:tcMar>
+              <w:top w:w="75" w:type="dxa"/>
+              <w:bottom w:w="75" w:type="dxa"/>
+              <w:left w:w="90" w:type="dxa"/>
+              <w:right w:w="90" w:type="dxa"/>
+            </w:tcMar>
+            <w:shd w:fill="FFFFFF"/>
+          </w:tcPr>
+          <w:p>
+            <w:pPr>
+              <w:keepNext w:val="0"/>
+              <w:spacing w:after="60"/>
+            </w:pPr>
+            <w:r>
+              <w:rPr>
+                <w:color w:val="000000"/>
+                <w:sz w:val="20"/>
+              </w:rPr>
+              <w:t>Duplicate actions</w:t>
+            </w:r>
+          </w:p>
+        </w:tc>
+        <w:tc>
+          <w:tcPr>
+            <w:tcW w:type="dxa" w:w="3030"/>
+            <w:vAlign w:val="center"/>
+            <w:tcMar>
+              <w:top w:w="75" w:type="dxa"/>
+              <w:bottom w:w="75" w:type="dxa"/>
+              <w:left w:w="90" w:type="dxa"/>
+              <w:right w:w="90" w:type="dxa"/>
+            </w:tcMar>
+            <w:shd w:fill="FFFFFF"/>
+          </w:tcPr>
+          <w:p>
+            <w:pPr>
+              <w:keepNext w:val="0"/>
+              <w:spacing w:after="60"/>
+            </w:pPr>
+            <w:r>
+              <w:rPr>
+                <w:color w:val="000000"/>
+                <w:sz w:val="20"/>
+              </w:rPr>
+              <w:t>Reconnect or retry could send the same prompt twice.</w:t>
+            </w:r>
+          </w:p>
+        </w:tc>
+        <w:tc>
+          <w:tcPr>
+            <w:tcW w:type="dxa" w:w="3830"/>
+            <w:vAlign w:val="center"/>
+            <w:tcMar>
+              <w:top w:w="75" w:type="dxa"/>
+              <w:bottom w:w="75" w:type="dxa"/>
+              <w:left w:w="90" w:type="dxa"/>
+              <w:right w:w="90" w:type="dxa"/>
+            </w:tcMar>
+            <w:shd w:fill="FFFFFF"/>
+          </w:tcPr>
+          <w:p>
+            <w:pPr>
+              <w:keepNext w:val="0"/>
+              <w:spacing w:after="60"/>
+            </w:pPr>
+            <w:r>
+              <w:rPr>
+                <w:color w:val="000000"/>
+                <w:sz w:val="20"/>
+              </w:rPr>
               <w:t>Durable action IDs, acknowledgement tracking, reconciliation, and no blind retries.</w:t>
+            </w:r>
+          </w:p>
+        </w:tc>
+      </w:tr>
+      <w:tr>
+        <w:trPr>
+          <w:cantSplit/>
+        </w:trPr>
+        <w:tc>
+          <w:tcPr>
+            <w:tcW w:type="dxa" w:w="2500"/>
+            <w:vAlign w:val="center"/>
+            <w:tcMar>
+              <w:top w:w="75" w:type="dxa"/>
+              <w:bottom w:w="75" w:type="dxa"/>
+              <w:left w:w="90" w:type="dxa"/>
+              <w:right w:w="90" w:type="dxa"/>
+            </w:tcMar>
+            <w:shd w:fill="FFFFFF"/>
+          </w:tcPr>
+          <w:p>
+            <w:pPr>
+              <w:keepNext w:val="0"/>
+              <w:spacing w:after="60"/>
+            </w:pPr>
+            <w:r>
+              <w:rPr>
+                <w:color w:val="000000"/>
+                <w:sz w:val="20"/>
+              </w:rPr>
+              <w:t>Supervisor failure</w:t>
+            </w:r>
+          </w:p>
+        </w:tc>
+        <w:tc>
+          <w:tcPr>
+            <w:tcW w:type="dxa" w:w="3030"/>
+            <w:vAlign w:val="center"/>
+            <w:tcMar>
+              <w:top w:w="75" w:type="dxa"/>
+              <w:bottom w:w="75" w:type="dxa"/>
+              <w:left w:w="90" w:type="dxa"/>
+              <w:right w:w="90" w:type="dxa"/>
+            </w:tcMar>
+            <w:shd w:fill="FFFFFF"/>
+          </w:tcPr>
+          <w:p>
+            <w:pPr>
+              <w:keepNext w:val="0"/>
+              <w:spacing w:after="60"/>
+            </w:pPr>
+            <w:r>
+              <w:rPr>
+                <w:color w:val="000000"/>
+                <w:sz w:val="20"/>
+              </w:rPr>
+              <w:t>A supervisor crash or upgrade drops managed sessions.</w:t>
+            </w:r>
+          </w:p>
+        </w:tc>
+        <w:tc>
+          <w:tcPr>
+            <w:tcW w:type="dxa" w:w="3830"/>
+            <w:vAlign w:val="center"/>
+            <w:tcMar>
+              <w:top w:w="75" w:type="dxa"/>
+              <w:bottom w:w="75" w:type="dxa"/>
+              <w:left w:w="90" w:type="dxa"/>
+              <w:right w:w="90" w:type="dxa"/>
+            </w:tcMar>
+            <w:shd w:fill="FFFFFF"/>
+          </w:tcPr>
+          <w:p>
+            <w:pPr>
+              <w:keepNext w:val="0"/>
+              <w:spacing w:after="60"/>
+            </w:pPr>
+            <w:r>
+              <w:rPr>
+                <w:color w:val="000000"/>
+                <w:sz w:val="20"/>
+              </w:rPr>
+              <w:t>Treat as disconnect: no automatic relaunch, offer native resume, versioned supervisor protocol and tested upgrade path.</w:t>
             </w:r>
           </w:p>
         </w:tc>
@@ -17147,7 +18285,7 @@
                 <w:color w:val="000000"/>
                 <w:sz w:val="20"/>
               </w:rPr>
-              <w:t>Local service owns connections independently of browser tabs.</w:t>
+              <w:t>Resolved: a detached session supervisor owns managed sessions and survives service restarts.</w:t>
             </w:r>
           </w:p>
         </w:tc>
@@ -17173,7 +18311,7 @@
                 <w:color w:val="000000"/>
                 <w:sz w:val="20"/>
               </w:rPr>
-              <w:t>Validate daemon restart behavior and surviving native sessions.</w:t>
+              <w:t>Validate each transport under the supervisor, supervisor crash and upgrade behavior, and host reboot limits.</w:t>
             </w:r>
           </w:p>
         </w:tc>
@@ -17230,7 +18368,7 @@
                 <w:color w:val="000000"/>
                 <w:sz w:val="20"/>
               </w:rPr>
-              <w:t>Global database plus optional .robin task artifacts.</w:t>
+              <w:t>Resolved: app-data store by default; .robin only by explicit export (TR-021).</w:t>
             </w:r>
           </w:p>
         </w:tc>
@@ -17256,7 +18394,7 @@
                 <w:color w:val="000000"/>
                 <w:sz w:val="20"/>
               </w:rPr>
-              <w:t>Compare repo-visible and private storage preferences.</w:t>
+              <w:t>Confirm export layout and repository-visibility warning.</w:t>
             </w:r>
           </w:p>
         </w:tc>
@@ -17396,7 +18534,7 @@
                 <w:color w:val="000000"/>
                 <w:sz w:val="20"/>
               </w:rPr>
-              <w:t>Files and adapter prompts; optional task-scoped MCP.</w:t>
+              <w:t>Resolved: task-scoped MCP or structured final-message block per adapter (TR-067).</w:t>
             </w:r>
           </w:p>
         </w:tc>
@@ -17422,7 +18560,173 @@
                 <w:color w:val="000000"/>
                 <w:sz w:val="20"/>
               </w:rPr>
-              <w:t>Verify attribution, acknowledgements, and schema compliance.</w:t>
+              <w:t>Choose the path for each runtime in Phase 0 and verify attribution.</w:t>
+            </w:r>
+          </w:p>
+        </w:tc>
+      </w:tr>
+      <w:tr>
+        <w:trPr>
+          <w:cantSplit/>
+        </w:trPr>
+        <w:tc>
+          <w:tcPr>
+            <w:tcW w:type="dxa" w:w="2500"/>
+            <w:vAlign w:val="center"/>
+            <w:tcMar>
+              <w:top w:w="75" w:type="dxa"/>
+              <w:bottom w:w="75" w:type="dxa"/>
+              <w:left w:w="90" w:type="dxa"/>
+              <w:right w:w="90" w:type="dxa"/>
+            </w:tcMar>
+            <w:shd w:fill="FFFFFF"/>
+          </w:tcPr>
+          <w:p>
+            <w:pPr>
+              <w:keepNext w:val="0"/>
+              <w:spacing w:after="60"/>
+            </w:pPr>
+            <w:r>
+              <w:rPr>
+                <w:color w:val="000000"/>
+                <w:sz w:val="20"/>
+              </w:rPr>
+              <w:t>Runtime scope</w:t>
+            </w:r>
+          </w:p>
+        </w:tc>
+        <w:tc>
+          <w:tcPr>
+            <w:tcW w:type="dxa" w:w="3850"/>
+            <w:vAlign w:val="center"/>
+            <w:tcMar>
+              <w:top w:w="75" w:type="dxa"/>
+              <w:bottom w:w="75" w:type="dxa"/>
+              <w:left w:w="90" w:type="dxa"/>
+              <w:right w:w="90" w:type="dxa"/>
+            </w:tcMar>
+            <w:shd w:fill="FFFFFF"/>
+          </w:tcPr>
+          <w:p>
+            <w:pPr>
+              <w:keepNext w:val="0"/>
+              <w:spacing w:after="60"/>
+            </w:pPr>
+            <w:r>
+              <w:rPr>
+                <w:color w:val="000000"/>
+                <w:sz w:val="20"/>
+              </w:rPr>
+              <w:t>Resolved: ship runtimes that meet the floor with live control; others ship observed-only.</w:t>
+            </w:r>
+          </w:p>
+        </w:tc>
+        <w:tc>
+          <w:tcPr>
+            <w:tcW w:type="dxa" w:w="3010"/>
+            <w:vAlign w:val="center"/>
+            <w:tcMar>
+              <w:top w:w="75" w:type="dxa"/>
+              <w:bottom w:w="75" w:type="dxa"/>
+              <w:left w:w="90" w:type="dxa"/>
+              <w:right w:w="90" w:type="dxa"/>
+            </w:tcMar>
+            <w:shd w:fill="FFFFFF"/>
+          </w:tcPr>
+          <w:p>
+            <w:pPr>
+              <w:keepNext w:val="0"/>
+              <w:spacing w:after="60"/>
+            </w:pPr>
+            <w:r>
+              <w:rPr>
+                <w:color w:val="000000"/>
+                <w:sz w:val="20"/>
+              </w:rPr>
+              <w:t>Classify each runtime in Phase 0 against the floor in §16.</w:t>
+            </w:r>
+          </w:p>
+        </w:tc>
+      </w:tr>
+      <w:tr>
+        <w:trPr>
+          <w:cantSplit/>
+        </w:trPr>
+        <w:tc>
+          <w:tcPr>
+            <w:tcW w:type="dxa" w:w="2500"/>
+            <w:vAlign w:val="center"/>
+            <w:tcMar>
+              <w:top w:w="75" w:type="dxa"/>
+              <w:bottom w:w="75" w:type="dxa"/>
+              <w:left w:w="90" w:type="dxa"/>
+              <w:right w:w="90" w:type="dxa"/>
+            </w:tcMar>
+            <w:shd w:fill="FFFFFF"/>
+          </w:tcPr>
+          <w:p>
+            <w:pPr>
+              <w:keepNext w:val="0"/>
+              <w:spacing w:after="60"/>
+            </w:pPr>
+            <w:r>
+              <w:rPr>
+                <w:color w:val="000000"/>
+                <w:sz w:val="20"/>
+              </w:rPr>
+              <w:t>Loop prevention and export priority</w:t>
+            </w:r>
+          </w:p>
+        </w:tc>
+        <w:tc>
+          <w:tcPr>
+            <w:tcW w:type="dxa" w:w="3850"/>
+            <w:vAlign w:val="center"/>
+            <w:tcMar>
+              <w:top w:w="75" w:type="dxa"/>
+              <w:bottom w:w="75" w:type="dxa"/>
+              <w:left w:w="90" w:type="dxa"/>
+              <w:right w:w="90" w:type="dxa"/>
+            </w:tcMar>
+            <w:shd w:fill="FFFFFF"/>
+          </w:tcPr>
+          <w:p>
+            <w:pPr>
+              <w:keepNext w:val="0"/>
+              <w:spacing w:after="60"/>
+            </w:pPr>
+            <w:r>
+              <w:rPr>
+                <w:color w:val="000000"/>
+                <w:sz w:val="20"/>
+              </w:rPr>
+              <w:t>Resolved: FR-025 is P1 with derived labels in the P0 preview; backup and export is P0 (FR-043).</w:t>
+            </w:r>
+          </w:p>
+        </w:tc>
+        <w:tc>
+          <w:tcPr>
+            <w:tcW w:type="dxa" w:w="3010"/>
+            <w:vAlign w:val="center"/>
+            <w:tcMar>
+              <w:top w:w="75" w:type="dxa"/>
+              <w:bottom w:w="75" w:type="dxa"/>
+              <w:left w:w="90" w:type="dxa"/>
+              <w:right w:w="90" w:type="dxa"/>
+            </w:tcMar>
+            <w:shd w:fill="FFFFFF"/>
+          </w:tcPr>
+          <w:p>
+            <w:pPr>
+              <w:keepNext w:val="0"/>
+              <w:spacing w:after="60"/>
+            </w:pPr>
+            <w:r>
+              <w:rPr>
+                <w:color w:val="000000"/>
+                <w:sz w:val="20"/>
+              </w:rPr>
+              <w:t>Confirm the restore test in the acceptance scenario.</w:t>
             </w:r>
           </w:p>
         </w:tc>
@@ -17658,6 +18962,10 @@
     <w:p>
       <w:pPr>
         <w:keepLines/>
+        <w:numPr>
+          <w:ilvl w:val="0"/>
+          <w:numId w:val="21"/>
+        </w:numPr>
       </w:pPr>
       <w:r>
         <w:rPr>
@@ -17669,6 +18977,10 @@
     <w:p>
       <w:pPr>
         <w:keepLines/>
+        <w:numPr>
+          <w:ilvl w:val="0"/>
+          <w:numId w:val="21"/>
+        </w:numPr>
       </w:pPr>
       <w:r>
         <w:rPr>
@@ -17680,6 +18992,10 @@
     <w:p>
       <w:pPr>
         <w:keepLines/>
+        <w:numPr>
+          <w:ilvl w:val="0"/>
+          <w:numId w:val="21"/>
+        </w:numPr>
       </w:pPr>
       <w:r>
         <w:rPr>
@@ -17691,6 +19007,10 @@
     <w:p>
       <w:pPr>
         <w:keepLines/>
+        <w:numPr>
+          <w:ilvl w:val="0"/>
+          <w:numId w:val="21"/>
+        </w:numPr>
       </w:pPr>
       <w:r>
         <w:rPr>
@@ -17727,7 +19047,7 @@
           <w:color w:val="202733"/>
           <w:sz w:val="21"/>
         </w:rPr>
-        <w:t>Document tested runtime versions, authentication requirements, operating systems, and capability differences.</w:t>
+        <w:t>Document tested runtime versions, authentication requirements, operating systems, capability differences, and each runtime's live or observed-only level.</w:t>
       </w:r>
     </w:p>
     <w:p>
@@ -17835,7 +19155,7 @@
           <w:color w:val="202733"/>
           <w:sz w:val="21"/>
         </w:rPr>
-        <w:t>Provide backup and export instructions for Robin metadata and task artifacts.</w:t>
+        <w:t>Provide backup, export, and restore instructions for Robin metadata and task artifacts (FR-043).</w:t>
       </w:r>
     </w:p>
     <w:p>
@@ -17859,6 +19179,10 @@
     <w:p>
       <w:pPr>
         <w:keepLines/>
+        <w:numPr>
+          <w:ilvl w:val="0"/>
+          <w:numId w:val="22"/>
+        </w:numPr>
       </w:pPr>
       <w:r>
         <w:rPr>
@@ -17870,6 +19194,10 @@
     <w:p>
       <w:pPr>
         <w:keepLines/>
+        <w:numPr>
+          <w:ilvl w:val="0"/>
+          <w:numId w:val="22"/>
+        </w:numPr>
       </w:pPr>
       <w:r>
         <w:rPr>
@@ -17903,35 +19231,313 @@
           <w:color w:val="233044"/>
           <w:sz w:val="17"/>
         </w:rPr>
-        <w:t>robin                         # Start service and open web dashboard</w:t>
+        <w:t xml:space="preserve">robin                         # Start service and open web dashboard</w:t>
+      </w:r>
+      <w:r>
+        <w:rPr>
+          <w:rFonts w:ascii="DejaVu Sans Mono" w:hAnsi="DejaVu Sans Mono"/>
+          <w:b w:val="0"/>
+          <w:color w:val="233044"/>
+          <w:sz w:val="17"/>
+        </w:rPr>
         <w:br/>
-        <w:t>robin serve                   # Run local service without opening browser</w:t>
+      </w:r>
+      <w:r>
+        <w:rPr>
+          <w:rFonts w:ascii="DejaVu Sans Mono" w:hAnsi="DejaVu Sans Mono"/>
+          <w:b w:val="0"/>
+          <w:color w:val="233044"/>
+          <w:sz w:val="17"/>
+        </w:rPr>
+        <w:t xml:space="preserve">robin serve                   # Run local service without opening browser</w:t>
+      </w:r>
+      <w:r>
+        <w:rPr>
+          <w:rFonts w:ascii="DejaVu Sans Mono" w:hAnsi="DejaVu Sans Mono"/>
+          <w:b w:val="0"/>
+          <w:color w:val="233044"/>
+          <w:sz w:val="17"/>
+        </w:rPr>
         <w:br/>
-        <w:t>robin scan                    # Index supported native sessions</w:t>
+      </w:r>
+      <w:r>
+        <w:rPr>
+          <w:rFonts w:ascii="DejaVu Sans Mono" w:hAnsi="DejaVu Sans Mono"/>
+          <w:b w:val="0"/>
+          <w:color w:val="233044"/>
+          <w:sz w:val="17"/>
+        </w:rPr>
+        <w:t xml:space="preserve">robin scan                    # Index supported native sessions</w:t>
+      </w:r>
+      <w:r>
+        <w:rPr>
+          <w:rFonts w:ascii="DejaVu Sans Mono" w:hAnsi="DejaVu Sans Mono"/>
+          <w:b w:val="0"/>
+          <w:color w:val="233044"/>
+          <w:sz w:val="17"/>
+        </w:rPr>
         <w:br/>
-        <w:t>robin search "tenant auth"    # Search indexed content</w:t>
+      </w:r>
+      <w:r>
+        <w:rPr>
+          <w:rFonts w:ascii="DejaVu Sans Mono" w:hAnsi="DejaVu Sans Mono"/>
+          <w:b w:val="0"/>
+          <w:color w:val="233044"/>
+          <w:sz w:val="17"/>
+        </w:rPr>
+        <w:t xml:space="preserve">robin search "tenant auth"    # Search indexed content</w:t>
+      </w:r>
+      <w:r>
+        <w:rPr>
+          <w:rFonts w:ascii="DejaVu Sans Mono" w:hAnsi="DejaVu Sans Mono"/>
+          <w:b w:val="0"/>
+          <w:color w:val="233044"/>
+          <w:sz w:val="17"/>
+        </w:rPr>
         <w:br/>
-        <w:t>robin task create NAME --attach PATH</w:t>
+      </w:r>
+      <w:r>
+        <w:rPr>
+          <w:rFonts w:ascii="DejaVu Sans Mono" w:hAnsi="DejaVu Sans Mono"/>
+          <w:b w:val="0"/>
+          <w:color w:val="233044"/>
+          <w:sz w:val="17"/>
+        </w:rPr>
+        <w:t xml:space="preserve">robin task create NAME --attach PATH</w:t>
+      </w:r>
+      <w:r>
+        <w:rPr>
+          <w:rFonts w:ascii="DejaVu Sans Mono" w:hAnsi="DejaVu Sans Mono"/>
+          <w:b w:val="0"/>
+          <w:color w:val="233044"/>
+          <w:sz w:val="17"/>
+        </w:rPr>
         <w:br/>
-        <w:t>robin task attach TASK SESSION</w:t>
+      </w:r>
+      <w:r>
+        <w:rPr>
+          <w:rFonts w:ascii="DejaVu Sans Mono" w:hAnsi="DejaVu Sans Mono"/>
+          <w:b w:val="0"/>
+          <w:color w:val="233044"/>
+          <w:sz w:val="17"/>
+        </w:rPr>
+        <w:t xml:space="preserve">robin task attach TASK SESSION</w:t>
+      </w:r>
+      <w:r>
+        <w:rPr>
+          <w:rFonts w:ascii="DejaVu Sans Mono" w:hAnsi="DejaVu Sans Mono"/>
+          <w:b w:val="0"/>
+          <w:color w:val="233044"/>
+          <w:sz w:val="17"/>
+        </w:rPr>
         <w:br/>
-        <w:t>robin run AGENT --task TASK --prompt FILE</w:t>
+      </w:r>
+      <w:r>
+        <w:rPr>
+          <w:rFonts w:ascii="DejaVu Sans Mono" w:hAnsi="DejaVu Sans Mono"/>
+          <w:b w:val="0"/>
+          <w:color w:val="233044"/>
+          <w:sz w:val="17"/>
+        </w:rPr>
+        <w:t xml:space="preserve">robin run AGENT --task TASK --prompt FILE</w:t>
+      </w:r>
+      <w:r>
+        <w:rPr>
+          <w:rFonts w:ascii="DejaVu Sans Mono" w:hAnsi="DejaVu Sans Mono"/>
+          <w:b w:val="0"/>
+          <w:color w:val="233044"/>
+          <w:sz w:val="17"/>
+        </w:rPr>
         <w:br/>
-        <w:t>robin resume SESSION          # Resume in original runtime</w:t>
+      </w:r>
+      <w:r>
+        <w:rPr>
+          <w:rFonts w:ascii="DejaVu Sans Mono" w:hAnsi="DejaVu Sans Mono"/>
+          <w:b w:val="0"/>
+          <w:color w:val="233044"/>
+          <w:sz w:val="17"/>
+        </w:rPr>
+        <w:t xml:space="preserve">robin resume SESSION          # Resume in original runtime</w:t>
+      </w:r>
+      <w:r>
+        <w:rPr>
+          <w:rFonts w:ascii="DejaVu Sans Mono" w:hAnsi="DejaVu Sans Mono"/>
+          <w:b w:val="0"/>
+          <w:color w:val="233044"/>
+          <w:sz w:val="17"/>
+        </w:rPr>
         <w:br/>
-        <w:t>robin message SESSION --file PROMPT</w:t>
+      </w:r>
+      <w:r>
+        <w:rPr>
+          <w:rFonts w:ascii="DejaVu Sans Mono" w:hAnsi="DejaVu Sans Mono"/>
+          <w:b w:val="0"/>
+          <w:color w:val="233044"/>
+          <w:sz w:val="17"/>
+        </w:rPr>
+        <w:t xml:space="preserve">robin message SESSION --file PROMPT</w:t>
+      </w:r>
+      <w:r>
+        <w:rPr>
+          <w:rFonts w:ascii="DejaVu Sans Mono" w:hAnsi="DejaVu Sans Mono"/>
+          <w:b w:val="0"/>
+          <w:color w:val="233044"/>
+          <w:sz w:val="17"/>
+        </w:rPr>
         <w:br/>
-        <w:t>robin interrupt SESSION       # Request supported interruption</w:t>
+      </w:r>
+      <w:r>
+        <w:rPr>
+          <w:rFonts w:ascii="DejaVu Sans Mono" w:hAnsi="DejaVu Sans Mono"/>
+          <w:b w:val="0"/>
+          <w:color w:val="233044"/>
+          <w:sz w:val="17"/>
+        </w:rPr>
+        <w:t xml:space="preserve">robin interrupt SESSION       # Request supported interruption</w:t>
+      </w:r>
+      <w:r>
+        <w:rPr>
+          <w:rFonts w:ascii="DejaVu Sans Mono" w:hAnsi="DejaVu Sans Mono"/>
+          <w:b w:val="0"/>
+          <w:color w:val="233044"/>
+          <w:sz w:val="17"/>
+        </w:rPr>
         <w:br/>
-        <w:t>robin open SESSION --terminal</w:t>
+      </w:r>
+      <w:r>
+        <w:rPr>
+          <w:rFonts w:ascii="DejaVu Sans Mono" w:hAnsi="DejaVu Sans Mono"/>
+          <w:b w:val="0"/>
+          <w:color w:val="233044"/>
+          <w:sz w:val="17"/>
+        </w:rPr>
+        <w:t xml:space="preserve">robin open SESSION --terminal # Hands off control per adapter terminal mode</w:t>
+      </w:r>
+      <w:r>
+        <w:rPr>
+          <w:rFonts w:ascii="DejaVu Sans Mono" w:hAnsi="DejaVu Sans Mono"/>
+          <w:b w:val="0"/>
+          <w:color w:val="233044"/>
+          <w:sz w:val="17"/>
+        </w:rPr>
         <w:br/>
-        <w:t>robin share SOURCE --to TARGET # Preview before sending</w:t>
+      </w:r>
+      <w:r>
+        <w:rPr>
+          <w:rFonts w:ascii="DejaVu Sans Mono" w:hAnsi="DejaVu Sans Mono"/>
+          <w:b w:val="0"/>
+          <w:color w:val="233044"/>
+          <w:sz w:val="17"/>
+        </w:rPr>
+        <w:t xml:space="preserve">robin share SOURCE --to SESSION [--prompt TEXT]  # Interactive preview and confirm</w:t>
+      </w:r>
+      <w:r>
+        <w:rPr>
+          <w:rFonts w:ascii="DejaVu Sans Mono" w:hAnsi="DejaVu Sans Mono"/>
+          <w:b w:val="0"/>
+          <w:color w:val="233044"/>
+          <w:sz w:val="17"/>
+        </w:rPr>
         <w:br/>
-        <w:t>robin compare --task TASK</w:t>
+      </w:r>
+      <w:r>
+        <w:rPr>
+          <w:rFonts w:ascii="DejaVu Sans Mono" w:hAnsi="DejaVu Sans Mono"/>
+          <w:b w:val="0"/>
+          <w:color w:val="233044"/>
+          <w:sz w:val="17"/>
+        </w:rPr>
+        <w:t xml:space="preserve">robin context preview SOURCE... --to SESSION     # Prints preview ID and hash</w:t>
+      </w:r>
+      <w:r>
+        <w:rPr>
+          <w:rFonts w:ascii="DejaVu Sans Mono" w:hAnsi="DejaVu Sans Mono"/>
+          <w:b w:val="0"/>
+          <w:color w:val="233044"/>
+          <w:sz w:val="17"/>
+        </w:rPr>
         <w:br/>
-        <w:t>robin synthesize --task TASK --agent NAME</w:t>
+      </w:r>
+      <w:r>
+        <w:rPr>
+          <w:rFonts w:ascii="DejaVu Sans Mono" w:hAnsi="DejaVu Sans Mono"/>
+          <w:b w:val="0"/>
+          <w:color w:val="233044"/>
+          <w:sz w:val="17"/>
+        </w:rPr>
+        <w:t xml:space="preserve">robin context deliver PREVIEW --confirm HASH     # Non-interactive delivery</w:t>
+      </w:r>
+      <w:r>
+        <w:rPr>
+          <w:rFonts w:ascii="DejaVu Sans Mono" w:hAnsi="DejaVu Sans Mono"/>
+          <w:b w:val="0"/>
+          <w:color w:val="233044"/>
+          <w:sz w:val="17"/>
+        </w:rPr>
         <w:br/>
-        <w:t>robin doctor                  # Runtime and capability diagnostics</w:t>
+      </w:r>
+      <w:r>
+        <w:rPr>
+          <w:rFonts w:ascii="DejaVu Sans Mono" w:hAnsi="DejaVu Sans Mono"/>
+          <w:b w:val="0"/>
+          <w:color w:val="233044"/>
+          <w:sz w:val="17"/>
+        </w:rPr>
+        <w:t xml:space="preserve">robin compare --task TASK</w:t>
+      </w:r>
+      <w:r>
+        <w:rPr>
+          <w:rFonts w:ascii="DejaVu Sans Mono" w:hAnsi="DejaVu Sans Mono"/>
+          <w:b w:val="0"/>
+          <w:color w:val="233044"/>
+          <w:sz w:val="17"/>
+        </w:rPr>
+        <w:br/>
+      </w:r>
+      <w:r>
+        <w:rPr>
+          <w:rFonts w:ascii="DejaVu Sans Mono" w:hAnsi="DejaVu Sans Mono"/>
+          <w:b w:val="0"/>
+          <w:color w:val="233044"/>
+          <w:sz w:val="17"/>
+        </w:rPr>
+        <w:t xml:space="preserve">robin synthesize --task TASK --agent NAME --findings ID,...</w:t>
+      </w:r>
+      <w:r>
+        <w:rPr>
+          <w:rFonts w:ascii="DejaVu Sans Mono" w:hAnsi="DejaVu Sans Mono"/>
+          <w:b w:val="0"/>
+          <w:color w:val="233044"/>
+          <w:sz w:val="17"/>
+        </w:rPr>
+        <w:br/>
+      </w:r>
+      <w:r>
+        <w:rPr>
+          <w:rFonts w:ascii="DejaVu Sans Mono" w:hAnsi="DejaVu Sans Mono"/>
+          <w:b w:val="0"/>
+          <w:color w:val="233044"/>
+          <w:sz w:val="17"/>
+        </w:rPr>
+        <w:t xml:space="preserve">robin doctor                  # Runtime and capability diagnostics</w:t>
+      </w:r>
+      <w:r>
+        <w:rPr>
+          <w:rFonts w:ascii="DejaVu Sans Mono" w:hAnsi="DejaVu Sans Mono"/>
+          <w:b w:val="0"/>
+          <w:color w:val="233044"/>
+          <w:sz w:val="17"/>
+        </w:rPr>
+        <w:br/>
+      </w:r>
+      <w:r>
+        <w:rPr>
+          <w:rFonts w:ascii="DejaVu Sans Mono" w:hAnsi="DejaVu Sans Mono"/>
+          <w:b w:val="0"/>
+          <w:color w:val="233044"/>
+          <w:sz w:val="17"/>
+        </w:rPr>
+        <w:t xml:space="preserve"># SESSION is a Robin session ID; SOURCE is a finding ID or excerpt reference.</w:t>
       </w:r>
     </w:p>
     <w:p>
@@ -18094,6 +19700,10 @@
     <w:p>
       <w:pPr>
         <w:keepLines/>
+        <w:numPr>
+          <w:ilvl w:val="0"/>
+          <w:numId w:val="23"/>
+        </w:numPr>
       </w:pPr>
       <w:r>
         <w:t>Verifies real launch, follow-up, interruption, resume, and approval behavior where claimed; fixtures alone do not establish native runtime compatibility.</w:t>
@@ -18102,6 +19712,10 @@
     <w:p>
       <w:pPr>
         <w:keepLines/>
+        <w:numPr>
+          <w:ilvl w:val="0"/>
+          <w:numId w:val="23"/>
+        </w:numPr>
       </w:pPr>
       <w:r>
         <w:t>Deduplicates events, preserves native request IDs, and exposes gaps or stale state after disconnect.</w:t>
@@ -18110,9 +19724,25 @@
     <w:p>
       <w:pPr>
         <w:keepLines/>
+        <w:numPr>
+          <w:ilvl w:val="0"/>
+          <w:numId w:val="23"/>
+        </w:numPr>
       </w:pPr>
       <w:r>
         <w:t>Handles expired requests and unknown delivery outcomes without automatic approval or blind resending.</w:t>
+      </w:r>
+    </w:p>
+    <w:p>
+      <w:pPr>
+        <w:keepLines/>
+        <w:numPr>
+          <w:ilvl w:val="0"/>
+          <w:numId w:val="23"/>
+        </w:numPr>
+      </w:pPr>
+      <w:r>
+        <w:t>Declares its terminal mode and finding publication path, and whether it enforces review independence.</w:t>
       </w:r>
     </w:p>
     <w:p>
@@ -18125,7 +19755,7 @@
         <w:rPr>
           <w:color w:val="000000"/>
         </w:rPr>
-        <w:t>Appendix C Integration references</w:t>
+        <w:t xml:space="preserve">Appendix C  Integration references</w:t>
       </w:r>
     </w:p>
     <w:p>
@@ -18144,14 +19774,14 @@
         <w:rPr>
           <w:b/>
         </w:rPr>
-        <w:t>Codex integration architecture</w:t>
+        <w:t>Codex app-server</w:t>
         <w:br/>
       </w:r>
       <w:r>
         <w:rPr>
           <w:sz w:val="18"/>
         </w:rPr>
-        <w:t>https://developers.openai.com/blog/codex-as-a-platform</w:t>
+        <w:t>https://developers.openai.com/codex/app-server/</w:t>
       </w:r>
     </w:p>
     <w:p>
@@ -18162,14 +19792,14 @@
         <w:rPr>
           <w:b/>
         </w:rPr>
-        <w:t>Claude Code programmatic execution</w:t>
+        <w:t>Claude Agent SDK overview</w:t>
         <w:br/>
       </w:r>
       <w:r>
         <w:rPr>
           <w:sz w:val="18"/>
         </w:rPr>
-        <w:t>https://code.claude.com/docs/en/headless</w:t>
+        <w:t>https://code.claude.com/docs/en/agent-sdk/overview</w:t>
       </w:r>
     </w:p>
     <w:p>
@@ -18180,7 +19810,25 @@
         <w:rPr>
           <w:b/>
         </w:rPr>
-        <w:t>Pi embedding SDK</w:t>
+        <w:t>Pi RPC mode</w:t>
+        <w:br/>
+      </w:r>
+      <w:r>
+        <w:rPr>
+          <w:sz w:val="18"/>
+        </w:rPr>
+        <w:t>https://github.com/earendil-works/pi/blob/main/packages/coding-agent/docs/rpc.md</w:t>
+      </w:r>
+    </w:p>
+    <w:p>
+      <w:pPr>
+        <w:keepLines/>
+      </w:pPr>
+      <w:r>
+        <w:rPr>
+          <w:b/>
+        </w:rPr>
+        <w:t>Pi embedding SDK (sidecar option)</w:t>
         <w:br/>
       </w:r>
       <w:r>
@@ -18224,6 +19872,24 @@
           <w:sz w:val="18"/>
         </w:rPr>
         <w:t>https://docs.rs/crate/bodysnatcher/0.3.0</w:t>
+      </w:r>
+    </w:p>
+    <w:p>
+      <w:pPr>
+        <w:keepLines/>
+      </w:pPr>
+      <w:r>
+        <w:rPr>
+          <w:b/>
+        </w:rPr>
+        <w:t>Codex platform overview (background)</w:t>
+        <w:br/>
+      </w:r>
+      <w:r>
+        <w:rPr>
+          <w:sz w:val="18"/>
+        </w:rPr>
+        <w:t>https://developers.openai.com/blog/codex-as-a-platform</w:t>
       </w:r>
     </w:p>
     <w:sectPr>

</xml_diff>

<commit_message>
Add implementation plan; update PRD v0.5 and TRD v0.4
Record owner decisions from implementation planning: macOS-only first
release on a Mac mini M4 reference machine, Claude Agent SDK as the
first adapter (Codex fallback), loopback-only with SSH forwarding,
opt-in observe-only hook installers (TR-076), a 20 GB activity cap,
gitleaks-based secret scanning, and worktrees kept at P1.
</commit_message>
<xml_diff>
--- a/docs/Robin_PRD.docx
+++ b/docs/Robin_PRD.docx
@@ -97,7 +97,7 @@
         <w:rPr>
           <w:b w:val="0"/>
         </w:rPr>
-        <w:t xml:space="preserve"> macOS and Linux; one execution host per workspace</w:t>
+        <w:t xml:space="preserve"> macOS; one execution host per workspace (Linux after the first release)</w:t>
       </w:r>
     </w:p>
     <w:p>
@@ -133,7 +133,7 @@
         <w:rPr>
           <w:b w:val="0"/>
         </w:rPr>
-        <w:t xml:space="preserve"> 0.4 - Owner decisions: runtime floor, priorities, and session supervisor</w:t>
+        <w:t xml:space="preserve"> 0.5 - Owner decisions: platform, first adapter, remote access, hooks, and retention</w:t>
       </w:r>
     </w:p>
     <w:p>
@@ -258,6 +258,26 @@
           <w:sz w:val="21"/>
         </w:rPr>
         <w:t>The MVP serves an individual developer on one execution host. It combines a browser dashboard, local application service, runtime adapters, a normalized event and search index, a findings store, and optional local MCP tools. CLI commands and native terminal access remain available. Robin owns its tasks and artifacts; the harness remains authoritative for its session state, tool execution, context management, and permission decisions.</w:t>
+      </w:r>
+    </w:p>
+    <w:p>
+      <w:pPr>
+        <w:pStyle w:val="Heading2"/>
+        <w:keepNext/>
+      </w:pPr>
+      <w:r>
+        <w:t xml:space="preserve">Version 0.5 changes</w:t>
+      </w:r>
+    </w:p>
+    <w:p>
+      <w:pPr>
+        <w:keepLines/>
+      </w:pPr>
+      <w:r>
+        <w:rPr>
+          <w:b w:val="0"/>
+        </w:rPr>
+        <w:t xml:space="preserve">This revision records the owner decisions taken while planning implementation (docs/implementation-plan.md). The first release supports macOS only, with a Mac mini M4 as the reference machine; Linux follows. The Claude Code adapter is built first through the Claude Agent SDK, using an API key if a subscription login is not accepted; Codex app-server is the fallback if Claude misses the capability floor. The MVP adds no remote listener: remote use goes through the user's own SSH port forwarding. Robin provides opt-in hook installers for each runtime that supports hooks (FR-041). Copied activity defaults to a 20 GB cap. Worktrees remain P1.</w:t>
       </w:r>
     </w:p>
     <w:p>
@@ -1977,7 +1997,7 @@
                 <w:color w:val="000000"/>
                 <w:sz w:val="20"/>
               </w:rPr>
-              <w:t>Access the same workspace over an explicit private connection; multi-host aggregation is later.</w:t>
+              <w:t>Reach the workspace from another machine through SSH port forwarding in the MVP; a private-network mode and multi-host aggregation are later.</w:t>
             </w:r>
           </w:p>
         </w:tc>
@@ -2919,7 +2939,7 @@
                 <w:color w:val="000000"/>
                 <w:sz w:val="20"/>
               </w:rPr>
-              <w:t>Claude Code, Codex, and Pi through versioned adapters. A runtime below the capability floor ships observed-only.</w:t>
+              <w:t>Claude Code, Codex, and Pi through versioned adapters, Claude Code first. A runtime below the capability floor ships observed-only.</w:t>
             </w:r>
           </w:p>
         </w:tc>
@@ -3002,7 +3022,7 @@
                 <w:color w:val="000000"/>
                 <w:sz w:val="20"/>
               </w:rPr>
-              <w:t>One local execution host; private access can be configured.</w:t>
+              <w:t>One local execution host on macOS, loopback only; remote use through SSH port forwarding.</w:t>
             </w:r>
           </w:p>
         </w:tc>
@@ -3028,7 +3048,7 @@
                 <w:color w:val="000000"/>
                 <w:sz w:val="20"/>
               </w:rPr>
-              <w:t>Multi-host aggregation and cloud synchronization.</w:t>
+              <w:t>Linux, private-network access, multi-host aggregation, and cloud synchronization.</w:t>
             </w:r>
           </w:p>
         </w:tc>
@@ -7087,7 +7107,7 @@
                 <w:color w:val="000000"/>
                 <w:sz w:val="21"/>
               </w:rPr>
-              <w:t>Ingest structured runtime events for managed sessions and supported hooks or logs for observed sessions.</w:t>
+              <w:t>Ingest structured runtime events for managed sessions. For observed sessions, ingest transcript logs and, where the user installs them, harness hooks.</w:t>
             </w:r>
           </w:p>
           <w:p>
@@ -7108,7 +7128,7 @@
                 <w:color w:val="000000"/>
                 <w:sz w:val="21"/>
               </w:rPr>
-              <w:t>Partial writes and unknown fields do not corrupt the index. Correlate sources, deduplicate events, and retain their original provenance. Installing harness hooks is opt-in, previewed, reversible, and never automatic.</w:t>
+              <w:t>Partial writes and unknown fields do not corrupt the index. Correlate sources, deduplicate events, and retain their original provenance. Installing harness hooks is opt-in, previewed, reversible, and never automatic. Robin provides a hook installer for each runtime with a supported hook mechanism. Hooks only observe: they never block or slow the harness and never return an approval decision.</w:t>
             </w:r>
           </w:p>
         </w:tc>
@@ -13527,7 +13547,7 @@
           <w:color w:val="202733"/>
           <w:sz w:val="21"/>
         </w:rPr>
-        <w:t>Optional access to the same execution host uses the user's SSH or private-network configuration. Aggregating several hosts and mobile controls are later features.</w:t>
+        <w:t>Remote use of the MVP goes through the user's own SSH port forwarding to the loopback service; Robin adds no remote listener. Private-network access, aggregating several hosts, and mobile controls are later features.</w:t>
       </w:r>
     </w:p>
     <w:p>
@@ -14710,7 +14730,7 @@
         <w:rPr>
           <w:b w:val="0"/>
         </w:rPr>
-        <w:t>Performance values are acceptance targets, not measured results. Record the reference machine, runtime versions, active-session count, and event volume during validation.</w:t>
+        <w:t>Performance values are acceptance targets, not measured results. Record the reference machine, runtime versions, active-session count, and event volume during validation. The reference machine is a Mac mini M4; record its exact configuration.</w:t>
       </w:r>
     </w:p>
     <w:p>
@@ -15564,7 +15584,7 @@
           <w:color w:val="202733"/>
           <w:sz w:val="21"/>
         </w:rPr>
-        <w:t>The MVP is accepted when the following end-to-end scenario succeeds on a clean supported macOS environment. Adapter validation also covers Linux. Fixtures test event edge cases; real installed harness runs verify live control. Steps that need live control apply to each runtime that meets the capability floor; an observed-only runtime completes the history and search steps.</w:t>
+        <w:t>The MVP is accepted when the following end-to-end scenario succeeds on a clean macOS environment on the reference machine. Fixtures test event edge cases; real installed harness runs verify live control. Steps that need live control apply to each runtime that meets the capability floor; an observed-only runtime completes the history and search steps.</w:t>
       </w:r>
     </w:p>
     <w:p>
@@ -16148,7 +16168,7 @@
                 <w:color w:val="000000"/>
                 <w:sz w:val="20"/>
               </w:rPr>
-              <w:t>Local API, session supervisor, one adapter, persistent actions/events, browser session card and activity feed.</w:t>
+              <w:t>Local API, session supervisor, one adapter (Claude Code first; Codex if Claude misses the floor), persistent actions/events, browser session card and activity feed.</w:t>
             </w:r>
           </w:p>
         </w:tc>
@@ -16231,7 +16251,7 @@
                 <w:color w:val="000000"/>
                 <w:sz w:val="20"/>
               </w:rPr>
-              <w:t>Projects/tasks, all adapters at their Phase 0 level, attention queue, native terminal access, state reconciliation.</w:t>
+              <w:t>Projects/tasks, all adapters at their Phase 0 level, attention queue, native terminal access, opt-in hook installers, state reconciliation.</w:t>
             </w:r>
           </w:p>
         </w:tc>
@@ -17840,7 +17860,7 @@
                 <w:color w:val="000000"/>
                 <w:sz w:val="20"/>
               </w:rPr>
-              <w:t>Offer worktrees for concurrent write tasks; show branch/worktree and warn when write sessions share a directory.</w:t>
+              <w:t>Show branch and directory and warn when write sessions share a directory; optional worktrees follow the MVP (FR-051, P1).</w:t>
             </w:r>
           </w:p>
         </w:tc>
@@ -17923,7 +17943,90 @@
                 <w:color w:val="000000"/>
                 <w:sz w:val="20"/>
               </w:rPr>
-              <w:t>Authenticated control API, origin checks, loopback binding, and private-network access only when configured.</w:t>
+              <w:t>Authenticated control API, origin checks, loopback binding, and no remote listener; remote use goes through SSH port forwarding.</w:t>
+            </w:r>
+          </w:p>
+        </w:tc>
+      </w:tr>
+      <w:tr>
+        <w:trPr>
+          <w:cantSplit/>
+        </w:trPr>
+        <w:tc>
+          <w:tcPr>
+            <w:tcW w:type="dxa" w:w="2500"/>
+            <w:vAlign w:val="center"/>
+            <w:tcMar>
+              <w:top w:w="75" w:type="dxa"/>
+              <w:bottom w:w="75" w:type="dxa"/>
+              <w:left w:w="90" w:type="dxa"/>
+              <w:right w:w="90" w:type="dxa"/>
+            </w:tcMar>
+            <w:shd w:fill="FFFFFF"/>
+          </w:tcPr>
+          <w:p>
+            <w:pPr>
+              <w:keepNext w:val="0"/>
+              <w:spacing w:after="60"/>
+            </w:pPr>
+            <w:r>
+              <w:rPr>
+                <w:color w:val="000000"/>
+                <w:sz w:val="20"/>
+              </w:rPr>
+              <w:t xml:space="preserve">Hook side effects</w:t>
+            </w:r>
+          </w:p>
+        </w:tc>
+        <w:tc>
+          <w:tcPr>
+            <w:tcW w:type="dxa" w:w="3030"/>
+            <w:vAlign w:val="center"/>
+            <w:tcMar>
+              <w:top w:w="75" w:type="dxa"/>
+              <w:bottom w:w="75" w:type="dxa"/>
+              <w:left w:w="90" w:type="dxa"/>
+              <w:right w:w="90" w:type="dxa"/>
+            </w:tcMar>
+            <w:shd w:fill="FFFFFF"/>
+          </w:tcPr>
+          <w:p>
+            <w:pPr>
+              <w:keepNext w:val="0"/>
+              <w:spacing w:after="60"/>
+            </w:pPr>
+            <w:r>
+              <w:rPr>
+                <w:color w:val="000000"/>
+                <w:sz w:val="20"/>
+              </w:rPr>
+              <w:t xml:space="preserve">A Robin hook slows or breaks the user's harness, or conflicts with existing hooks.</w:t>
+            </w:r>
+          </w:p>
+        </w:tc>
+        <w:tc>
+          <w:tcPr>
+            <w:tcW w:type="dxa" w:w="3830"/>
+            <w:vAlign w:val="center"/>
+            <w:tcMar>
+              <w:top w:w="75" w:type="dxa"/>
+              <w:bottom w:w="75" w:type="dxa"/>
+              <w:left w:w="90" w:type="dxa"/>
+              <w:right w:w="90" w:type="dxa"/>
+            </w:tcMar>
+            <w:shd w:fill="FFFFFF"/>
+          </w:tcPr>
+          <w:p>
+            <w:pPr>
+              <w:keepNext w:val="0"/>
+              <w:spacing w:after="60"/>
+            </w:pPr>
+            <w:r>
+              <w:rPr>
+                <w:color w:val="000000"/>
+                <w:sz w:val="20"/>
+              </w:rPr>
+              <w:t xml:space="preserve">Observe-only hooks, short timeout, always exit 0, previewed install alongside existing hooks, and exact uninstall.</w:t>
             </w:r>
           </w:p>
         </w:tc>
@@ -18202,7 +18305,7 @@
                 <w:color w:val="000000"/>
                 <w:sz w:val="20"/>
               </w:rPr>
-              <w:t>Codex app-server; Claude Agent SDK; Pi RPC or SDK sidecar.</w:t>
+              <w:t>Resolved order: Claude Agent SDK first (API key if needed); Codex app-server as fallback and second adapter; Pi RPC or SDK sidecar.</w:t>
             </w:r>
           </w:p>
         </w:tc>
@@ -18451,7 +18554,7 @@
                 <w:color w:val="000000"/>
                 <w:sz w:val="20"/>
               </w:rPr>
-              <w:t>Configurable normalized copies and activity retention.</w:t>
+              <w:t>Resolved: copied activity and transcript text default to a 20 GB cap, pruned oldest first; findings, manifests, and audit records are kept.</w:t>
             </w:r>
           </w:p>
         </w:tc>
@@ -18477,7 +18580,7 @@
                 <w:color w:val="000000"/>
                 <w:sz w:val="20"/>
               </w:rPr>
-              <w:t>Measure growth and confirm sensitive-data exclusions.</w:t>
+              <w:t>Measure growth against the cap and confirm sensitive-data exclusions.</w:t>
             </w:r>
           </w:p>
         </w:tc>
@@ -18500,7 +18603,7 @@
           </w:tcPr>
           <w:p>
             <w:pPr>
-              <w:keepNext/>
+              <w:keepNext w:val="0"/>
               <w:spacing w:after="60"/>
             </w:pPr>
             <w:r>
@@ -18508,7 +18611,7 @@
                 <w:color w:val="000000"/>
                 <w:sz w:val="20"/>
               </w:rPr>
-              <w:t>Finding delivery</w:t>
+              <w:t xml:space="preserve">Platform</w:t>
             </w:r>
           </w:p>
         </w:tc>
@@ -18526,7 +18629,7 @@
           </w:tcPr>
           <w:p>
             <w:pPr>
-              <w:keepNext/>
+              <w:keepNext w:val="0"/>
               <w:spacing w:after="60"/>
             </w:pPr>
             <w:r>
@@ -18534,7 +18637,7 @@
                 <w:color w:val="000000"/>
                 <w:sz w:val="20"/>
               </w:rPr>
-              <w:t>Resolved: task-scoped MCP or structured final-message block per adapter (TR-067).</w:t>
+              <w:t xml:space="preserve">Resolved: macOS only for the first release; Mac mini M4 reference machine.</w:t>
             </w:r>
           </w:p>
         </w:tc>
@@ -18552,7 +18655,7 @@
           </w:tcPr>
           <w:p>
             <w:pPr>
-              <w:keepNext/>
+              <w:keepNext w:val="0"/>
               <w:spacing w:after="60"/>
             </w:pPr>
             <w:r>
@@ -18560,7 +18663,7 @@
                 <w:color w:val="000000"/>
                 <w:sz w:val="20"/>
               </w:rPr>
-              <w:t>Choose the path for each runtime in Phase 0 and verify attribution.</w:t>
+              <w:t xml:space="preserve">Record the reference configuration; plan Linux validation after release.</w:t>
             </w:r>
           </w:p>
         </w:tc>
@@ -18591,7 +18694,7 @@
                 <w:color w:val="000000"/>
                 <w:sz w:val="20"/>
               </w:rPr>
-              <w:t>Runtime scope</w:t>
+              <w:t xml:space="preserve">Remote access</w:t>
             </w:r>
           </w:p>
         </w:tc>
@@ -18617,7 +18720,7 @@
                 <w:color w:val="000000"/>
                 <w:sz w:val="20"/>
               </w:rPr>
-              <w:t>Resolved: ship runtimes that meet the floor with live control; others ship observed-only.</w:t>
+              <w:t xml:space="preserve">Resolved: loopback only; SSH port forwarding for remote use.</w:t>
             </w:r>
           </w:p>
         </w:tc>
@@ -18643,7 +18746,7 @@
                 <w:color w:val="000000"/>
                 <w:sz w:val="20"/>
               </w:rPr>
-              <w:t>Classify each runtime in Phase 0 against the floor in §16.</w:t>
+              <w:t xml:space="preserve">Confirm the dashboard works through an SSH tunnel.</w:t>
             </w:r>
           </w:p>
         </w:tc>
@@ -18674,7 +18777,7 @@
                 <w:color w:val="000000"/>
                 <w:sz w:val="20"/>
               </w:rPr>
-              <w:t>Loop prevention and export priority</w:t>
+              <w:t xml:space="preserve">Observed-session hooks</w:t>
             </w:r>
           </w:p>
         </w:tc>
@@ -18700,7 +18803,7 @@
                 <w:color w:val="000000"/>
                 <w:sz w:val="20"/>
               </w:rPr>
-              <w:t>Resolved: FR-025 is P1 with derived labels in the P0 preview; backup and export is P0 (FR-043).</w:t>
+              <w:t xml:space="preserve">Resolved: opt-in installers for each runtime that supports hooks (FR-041).</w:t>
             </w:r>
           </w:p>
         </w:tc>
@@ -18726,7 +18829,7 @@
                 <w:color w:val="000000"/>
                 <w:sz w:val="20"/>
               </w:rPr>
-              <w:t>Confirm the restore test in the acceptance scenario.</w:t>
+              <w:t xml:space="preserve">Confirm each runtime's hook mechanism in Phase 0.</w:t>
             </w:r>
           </w:p>
         </w:tc>
@@ -18749,7 +18852,7 @@
           </w:tcPr>
           <w:p>
             <w:pPr>
-              <w:keepNext w:val="0"/>
+              <w:keepNext/>
               <w:spacing w:after="60"/>
             </w:pPr>
             <w:r>
@@ -18757,7 +18860,7 @@
                 <w:color w:val="000000"/>
                 <w:sz w:val="20"/>
               </w:rPr>
-              <w:t>Working title</w:t>
+              <w:t>Finding delivery</w:t>
             </w:r>
           </w:p>
         </w:tc>
@@ -18775,7 +18878,7 @@
           </w:tcPr>
           <w:p>
             <w:pPr>
-              <w:keepNext w:val="0"/>
+              <w:keepNext/>
               <w:spacing w:after="60"/>
             </w:pPr>
             <w:r>
@@ -18783,7 +18886,7 @@
                 <w:color w:val="000000"/>
                 <w:sz w:val="20"/>
               </w:rPr>
-              <w:t>Robin.</w:t>
+              <w:t>Resolved: task-scoped MCP or structured final-message block per adapter (TR-067).</w:t>
             </w:r>
           </w:p>
         </w:tc>
@@ -18801,6 +18904,37 @@
           </w:tcPr>
           <w:p>
             <w:pPr>
+              <w:keepNext/>
+              <w:spacing w:after="60"/>
+            </w:pPr>
+            <w:r>
+              <w:rPr>
+                <w:color w:val="000000"/>
+                <w:sz w:val="20"/>
+              </w:rPr>
+              <w:t>Choose the path for each runtime in Phase 0 and verify attribution.</w:t>
+            </w:r>
+          </w:p>
+        </w:tc>
+      </w:tr>
+      <w:tr>
+        <w:trPr>
+          <w:cantSplit/>
+        </w:trPr>
+        <w:tc>
+          <w:tcPr>
+            <w:tcW w:type="dxa" w:w="2500"/>
+            <w:vAlign w:val="center"/>
+            <w:tcMar>
+              <w:top w:w="75" w:type="dxa"/>
+              <w:bottom w:w="75" w:type="dxa"/>
+              <w:left w:w="90" w:type="dxa"/>
+              <w:right w:w="90" w:type="dxa"/>
+            </w:tcMar>
+            <w:shd w:fill="FFFFFF"/>
+          </w:tcPr>
+          <w:p>
+            <w:pPr>
               <w:keepNext w:val="0"/>
               <w:spacing w:after="60"/>
             </w:pPr>
@@ -18809,7 +18943,225 @@
                 <w:color w:val="000000"/>
                 <w:sz w:val="20"/>
               </w:rPr>
-              <w:t>Check package, executable, and repository-name availability.</w:t>
+              <w:t>Runtime scope</w:t>
+            </w:r>
+          </w:p>
+        </w:tc>
+        <w:tc>
+          <w:tcPr>
+            <w:tcW w:type="dxa" w:w="3850"/>
+            <w:vAlign w:val="center"/>
+            <w:tcMar>
+              <w:top w:w="75" w:type="dxa"/>
+              <w:bottom w:w="75" w:type="dxa"/>
+              <w:left w:w="90" w:type="dxa"/>
+              <w:right w:w="90" w:type="dxa"/>
+            </w:tcMar>
+            <w:shd w:fill="FFFFFF"/>
+          </w:tcPr>
+          <w:p>
+            <w:pPr>
+              <w:keepNext w:val="0"/>
+              <w:spacing w:after="60"/>
+            </w:pPr>
+            <w:r>
+              <w:rPr>
+                <w:color w:val="000000"/>
+                <w:sz w:val="20"/>
+              </w:rPr>
+              <w:t>Resolved: ship runtimes that meet the floor with live control; others ship observed-only.</w:t>
+            </w:r>
+          </w:p>
+        </w:tc>
+        <w:tc>
+          <w:tcPr>
+            <w:tcW w:type="dxa" w:w="3010"/>
+            <w:vAlign w:val="center"/>
+            <w:tcMar>
+              <w:top w:w="75" w:type="dxa"/>
+              <w:bottom w:w="75" w:type="dxa"/>
+              <w:left w:w="90" w:type="dxa"/>
+              <w:right w:w="90" w:type="dxa"/>
+            </w:tcMar>
+            <w:shd w:fill="FFFFFF"/>
+          </w:tcPr>
+          <w:p>
+            <w:pPr>
+              <w:keepNext w:val="0"/>
+              <w:spacing w:after="60"/>
+            </w:pPr>
+            <w:r>
+              <w:rPr>
+                <w:color w:val="000000"/>
+                <w:sz w:val="20"/>
+              </w:rPr>
+              <w:t>Classify each runtime in Phase 0 against the floor in §16.</w:t>
+            </w:r>
+          </w:p>
+        </w:tc>
+      </w:tr>
+      <w:tr>
+        <w:trPr>
+          <w:cantSplit/>
+        </w:trPr>
+        <w:tc>
+          <w:tcPr>
+            <w:tcW w:type="dxa" w:w="2500"/>
+            <w:vAlign w:val="center"/>
+            <w:tcMar>
+              <w:top w:w="75" w:type="dxa"/>
+              <w:bottom w:w="75" w:type="dxa"/>
+              <w:left w:w="90" w:type="dxa"/>
+              <w:right w:w="90" w:type="dxa"/>
+            </w:tcMar>
+            <w:shd w:fill="FFFFFF"/>
+          </w:tcPr>
+          <w:p>
+            <w:pPr>
+              <w:keepNext w:val="0"/>
+              <w:spacing w:after="60"/>
+            </w:pPr>
+            <w:r>
+              <w:rPr>
+                <w:color w:val="000000"/>
+                <w:sz w:val="20"/>
+              </w:rPr>
+              <w:t>Loop prevention and export priority</w:t>
+            </w:r>
+          </w:p>
+        </w:tc>
+        <w:tc>
+          <w:tcPr>
+            <w:tcW w:type="dxa" w:w="3850"/>
+            <w:vAlign w:val="center"/>
+            <w:tcMar>
+              <w:top w:w="75" w:type="dxa"/>
+              <w:bottom w:w="75" w:type="dxa"/>
+              <w:left w:w="90" w:type="dxa"/>
+              <w:right w:w="90" w:type="dxa"/>
+            </w:tcMar>
+            <w:shd w:fill="FFFFFF"/>
+          </w:tcPr>
+          <w:p>
+            <w:pPr>
+              <w:keepNext w:val="0"/>
+              <w:spacing w:after="60"/>
+            </w:pPr>
+            <w:r>
+              <w:rPr>
+                <w:color w:val="000000"/>
+                <w:sz w:val="20"/>
+              </w:rPr>
+              <w:t>Resolved: FR-025 is P1 with derived labels in the P0 preview; backup and export is P0 (FR-043).</w:t>
+            </w:r>
+          </w:p>
+        </w:tc>
+        <w:tc>
+          <w:tcPr>
+            <w:tcW w:type="dxa" w:w="3010"/>
+            <w:vAlign w:val="center"/>
+            <w:tcMar>
+              <w:top w:w="75" w:type="dxa"/>
+              <w:bottom w:w="75" w:type="dxa"/>
+              <w:left w:w="90" w:type="dxa"/>
+              <w:right w:w="90" w:type="dxa"/>
+            </w:tcMar>
+            <w:shd w:fill="FFFFFF"/>
+          </w:tcPr>
+          <w:p>
+            <w:pPr>
+              <w:keepNext w:val="0"/>
+              <w:spacing w:after="60"/>
+            </w:pPr>
+            <w:r>
+              <w:rPr>
+                <w:color w:val="000000"/>
+                <w:sz w:val="20"/>
+              </w:rPr>
+              <w:t>Confirm the restore test in the acceptance scenario.</w:t>
+            </w:r>
+          </w:p>
+        </w:tc>
+      </w:tr>
+      <w:tr>
+        <w:trPr>
+          <w:cantSplit/>
+        </w:trPr>
+        <w:tc>
+          <w:tcPr>
+            <w:tcW w:type="dxa" w:w="2500"/>
+            <w:vAlign w:val="center"/>
+            <w:tcMar>
+              <w:top w:w="75" w:type="dxa"/>
+              <w:bottom w:w="75" w:type="dxa"/>
+              <w:left w:w="90" w:type="dxa"/>
+              <w:right w:w="90" w:type="dxa"/>
+            </w:tcMar>
+            <w:shd w:fill="FFFFFF"/>
+          </w:tcPr>
+          <w:p>
+            <w:pPr>
+              <w:keepNext w:val="0"/>
+              <w:spacing w:after="60"/>
+            </w:pPr>
+            <w:r>
+              <w:rPr>
+                <w:color w:val="000000"/>
+                <w:sz w:val="20"/>
+              </w:rPr>
+              <w:t>Working title</w:t>
+            </w:r>
+          </w:p>
+        </w:tc>
+        <w:tc>
+          <w:tcPr>
+            <w:tcW w:type="dxa" w:w="3850"/>
+            <w:vAlign w:val="center"/>
+            <w:tcMar>
+              <w:top w:w="75" w:type="dxa"/>
+              <w:bottom w:w="75" w:type="dxa"/>
+              <w:left w:w="90" w:type="dxa"/>
+              <w:right w:w="90" w:type="dxa"/>
+            </w:tcMar>
+            <w:shd w:fill="FFFFFF"/>
+          </w:tcPr>
+          <w:p>
+            <w:pPr>
+              <w:keepNext w:val="0"/>
+              <w:spacing w:after="60"/>
+            </w:pPr>
+            <w:r>
+              <w:rPr>
+                <w:color w:val="000000"/>
+                <w:sz w:val="20"/>
+              </w:rPr>
+              <w:t>Robin.</w:t>
+            </w:r>
+          </w:p>
+        </w:tc>
+        <w:tc>
+          <w:tcPr>
+            <w:tcW w:type="dxa" w:w="3010"/>
+            <w:vAlign w:val="center"/>
+            <w:tcMar>
+              <w:top w:w="75" w:type="dxa"/>
+              <w:bottom w:w="75" w:type="dxa"/>
+              <w:left w:w="90" w:type="dxa"/>
+              <w:right w:w="90" w:type="dxa"/>
+            </w:tcMar>
+            <w:shd w:fill="FFFFFF"/>
+          </w:tcPr>
+          <w:p>
+            <w:pPr>
+              <w:keepNext w:val="0"/>
+              <w:spacing w:after="60"/>
+            </w:pPr>
+            <w:r>
+              <w:rPr>
+                <w:color w:val="000000"/>
+                <w:sz w:val="20"/>
+              </w:rPr>
+              <w:t>Private project: confirm no command clash on the Mac mini.</w:t>
             </w:r>
           </w:p>
         </w:tc>
@@ -18831,6 +19183,36 @@
           <w:color w:val="000000"/>
         </w:rPr>
         <w:t>19  Future roadmap</w:t>
+      </w:r>
+    </w:p>
+    <w:p>
+      <w:pPr>
+        <w:keepLines/>
+        <w:numPr>
+          <w:ilvl w:val="0"/>
+          <w:numId w:val="21"/>
+        </w:numPr>
+      </w:pPr>
+      <w:r>
+        <w:rPr>
+          <w:b w:val="0"/>
+        </w:rPr>
+        <w:t xml:space="preserve">Linux support.</w:t>
+      </w:r>
+    </w:p>
+    <w:p>
+      <w:pPr>
+        <w:keepLines/>
+        <w:numPr>
+          <w:ilvl w:val="0"/>
+          <w:numId w:val="21"/>
+        </w:numPr>
+      </w:pPr>
+      <w:r>
+        <w:rPr>
+          <w:b w:val="0"/>
+        </w:rPr>
+        <w:t xml:space="preserve">Private-network access to the same host (UC-05).</w:t>
       </w:r>
     </w:p>
     <w:p>
@@ -19232,311 +19614,43 @@
           <w:sz w:val="17"/>
         </w:rPr>
         <w:t xml:space="preserve">robin                         # Start service and open web dashboard</w:t>
-      </w:r>
-      <w:r>
-        <w:rPr>
-          <w:rFonts w:ascii="DejaVu Sans Mono" w:hAnsi="DejaVu Sans Mono"/>
-          <w:b w:val="0"/>
-          <w:color w:val="233044"/>
-          <w:sz w:val="17"/>
-        </w:rPr>
         <w:br/>
-      </w:r>
-      <w:r>
-        <w:rPr>
-          <w:rFonts w:ascii="DejaVu Sans Mono" w:hAnsi="DejaVu Sans Mono"/>
-          <w:b w:val="0"/>
-          <w:color w:val="233044"/>
-          <w:sz w:val="17"/>
-        </w:rPr>
         <w:t xml:space="preserve">robin serve                   # Run local service without opening browser</w:t>
-      </w:r>
-      <w:r>
-        <w:rPr>
-          <w:rFonts w:ascii="DejaVu Sans Mono" w:hAnsi="DejaVu Sans Mono"/>
-          <w:b w:val="0"/>
-          <w:color w:val="233044"/>
-          <w:sz w:val="17"/>
-        </w:rPr>
         <w:br/>
-      </w:r>
-      <w:r>
-        <w:rPr>
-          <w:rFonts w:ascii="DejaVu Sans Mono" w:hAnsi="DejaVu Sans Mono"/>
-          <w:b w:val="0"/>
-          <w:color w:val="233044"/>
-          <w:sz w:val="17"/>
-        </w:rPr>
         <w:t xml:space="preserve">robin scan                    # Index supported native sessions</w:t>
-      </w:r>
-      <w:r>
-        <w:rPr>
-          <w:rFonts w:ascii="DejaVu Sans Mono" w:hAnsi="DejaVu Sans Mono"/>
-          <w:b w:val="0"/>
-          <w:color w:val="233044"/>
-          <w:sz w:val="17"/>
-        </w:rPr>
         <w:br/>
-      </w:r>
-      <w:r>
-        <w:rPr>
-          <w:rFonts w:ascii="DejaVu Sans Mono" w:hAnsi="DejaVu Sans Mono"/>
-          <w:b w:val="0"/>
-          <w:color w:val="233044"/>
-          <w:sz w:val="17"/>
-        </w:rPr>
         <w:t xml:space="preserve">robin search "tenant auth"    # Search indexed content</w:t>
-      </w:r>
-      <w:r>
-        <w:rPr>
-          <w:rFonts w:ascii="DejaVu Sans Mono" w:hAnsi="DejaVu Sans Mono"/>
-          <w:b w:val="0"/>
-          <w:color w:val="233044"/>
-          <w:sz w:val="17"/>
-        </w:rPr>
         <w:br/>
-      </w:r>
-      <w:r>
-        <w:rPr>
-          <w:rFonts w:ascii="DejaVu Sans Mono" w:hAnsi="DejaVu Sans Mono"/>
-          <w:b w:val="0"/>
-          <w:color w:val="233044"/>
-          <w:sz w:val="17"/>
-        </w:rPr>
         <w:t xml:space="preserve">robin task create NAME --attach PATH</w:t>
-      </w:r>
-      <w:r>
-        <w:rPr>
-          <w:rFonts w:ascii="DejaVu Sans Mono" w:hAnsi="DejaVu Sans Mono"/>
-          <w:b w:val="0"/>
-          <w:color w:val="233044"/>
-          <w:sz w:val="17"/>
-        </w:rPr>
         <w:br/>
-      </w:r>
-      <w:r>
-        <w:rPr>
-          <w:rFonts w:ascii="DejaVu Sans Mono" w:hAnsi="DejaVu Sans Mono"/>
-          <w:b w:val="0"/>
-          <w:color w:val="233044"/>
-          <w:sz w:val="17"/>
-        </w:rPr>
         <w:t xml:space="preserve">robin task attach TASK SESSION</w:t>
-      </w:r>
-      <w:r>
-        <w:rPr>
-          <w:rFonts w:ascii="DejaVu Sans Mono" w:hAnsi="DejaVu Sans Mono"/>
-          <w:b w:val="0"/>
-          <w:color w:val="233044"/>
-          <w:sz w:val="17"/>
-        </w:rPr>
         <w:br/>
-      </w:r>
-      <w:r>
-        <w:rPr>
-          <w:rFonts w:ascii="DejaVu Sans Mono" w:hAnsi="DejaVu Sans Mono"/>
-          <w:b w:val="0"/>
-          <w:color w:val="233044"/>
-          <w:sz w:val="17"/>
-        </w:rPr>
         <w:t xml:space="preserve">robin run AGENT --task TASK --prompt FILE</w:t>
-      </w:r>
-      <w:r>
-        <w:rPr>
-          <w:rFonts w:ascii="DejaVu Sans Mono" w:hAnsi="DejaVu Sans Mono"/>
-          <w:b w:val="0"/>
-          <w:color w:val="233044"/>
-          <w:sz w:val="17"/>
-        </w:rPr>
         <w:br/>
-      </w:r>
-      <w:r>
-        <w:rPr>
-          <w:rFonts w:ascii="DejaVu Sans Mono" w:hAnsi="DejaVu Sans Mono"/>
-          <w:b w:val="0"/>
-          <w:color w:val="233044"/>
-          <w:sz w:val="17"/>
-        </w:rPr>
         <w:t xml:space="preserve">robin resume SESSION          # Resume in original runtime</w:t>
-      </w:r>
-      <w:r>
-        <w:rPr>
-          <w:rFonts w:ascii="DejaVu Sans Mono" w:hAnsi="DejaVu Sans Mono"/>
-          <w:b w:val="0"/>
-          <w:color w:val="233044"/>
-          <w:sz w:val="17"/>
-        </w:rPr>
         <w:br/>
-      </w:r>
-      <w:r>
-        <w:rPr>
-          <w:rFonts w:ascii="DejaVu Sans Mono" w:hAnsi="DejaVu Sans Mono"/>
-          <w:b w:val="0"/>
-          <w:color w:val="233044"/>
-          <w:sz w:val="17"/>
-        </w:rPr>
         <w:t xml:space="preserve">robin message SESSION --file PROMPT</w:t>
-      </w:r>
-      <w:r>
-        <w:rPr>
-          <w:rFonts w:ascii="DejaVu Sans Mono" w:hAnsi="DejaVu Sans Mono"/>
-          <w:b w:val="0"/>
-          <w:color w:val="233044"/>
-          <w:sz w:val="17"/>
-        </w:rPr>
         <w:br/>
-      </w:r>
-      <w:r>
-        <w:rPr>
-          <w:rFonts w:ascii="DejaVu Sans Mono" w:hAnsi="DejaVu Sans Mono"/>
-          <w:b w:val="0"/>
-          <w:color w:val="233044"/>
-          <w:sz w:val="17"/>
-        </w:rPr>
         <w:t xml:space="preserve">robin interrupt SESSION       # Request supported interruption</w:t>
-      </w:r>
-      <w:r>
-        <w:rPr>
-          <w:rFonts w:ascii="DejaVu Sans Mono" w:hAnsi="DejaVu Sans Mono"/>
-          <w:b w:val="0"/>
-          <w:color w:val="233044"/>
-          <w:sz w:val="17"/>
-        </w:rPr>
         <w:br/>
-      </w:r>
-      <w:r>
-        <w:rPr>
-          <w:rFonts w:ascii="DejaVu Sans Mono" w:hAnsi="DejaVu Sans Mono"/>
-          <w:b w:val="0"/>
-          <w:color w:val="233044"/>
-          <w:sz w:val="17"/>
-        </w:rPr>
         <w:t xml:space="preserve">robin open SESSION --terminal # Hands off control per adapter terminal mode</w:t>
-      </w:r>
-      <w:r>
-        <w:rPr>
-          <w:rFonts w:ascii="DejaVu Sans Mono" w:hAnsi="DejaVu Sans Mono"/>
-          <w:b w:val="0"/>
-          <w:color w:val="233044"/>
-          <w:sz w:val="17"/>
-        </w:rPr>
         <w:br/>
-      </w:r>
-      <w:r>
-        <w:rPr>
-          <w:rFonts w:ascii="DejaVu Sans Mono" w:hAnsi="DejaVu Sans Mono"/>
-          <w:b w:val="0"/>
-          <w:color w:val="233044"/>
-          <w:sz w:val="17"/>
-        </w:rPr>
         <w:t xml:space="preserve">robin share SOURCE --to SESSION [--prompt TEXT]  # Interactive preview and confirm</w:t>
-      </w:r>
-      <w:r>
-        <w:rPr>
-          <w:rFonts w:ascii="DejaVu Sans Mono" w:hAnsi="DejaVu Sans Mono"/>
-          <w:b w:val="0"/>
-          <w:color w:val="233044"/>
-          <w:sz w:val="17"/>
-        </w:rPr>
         <w:br/>
-      </w:r>
-      <w:r>
-        <w:rPr>
-          <w:rFonts w:ascii="DejaVu Sans Mono" w:hAnsi="DejaVu Sans Mono"/>
-          <w:b w:val="0"/>
-          <w:color w:val="233044"/>
-          <w:sz w:val="17"/>
-        </w:rPr>
         <w:t xml:space="preserve">robin context preview SOURCE... --to SESSION     # Prints preview ID and hash</w:t>
-      </w:r>
-      <w:r>
-        <w:rPr>
-          <w:rFonts w:ascii="DejaVu Sans Mono" w:hAnsi="DejaVu Sans Mono"/>
-          <w:b w:val="0"/>
-          <w:color w:val="233044"/>
-          <w:sz w:val="17"/>
-        </w:rPr>
         <w:br/>
-      </w:r>
-      <w:r>
-        <w:rPr>
-          <w:rFonts w:ascii="DejaVu Sans Mono" w:hAnsi="DejaVu Sans Mono"/>
-          <w:b w:val="0"/>
-          <w:color w:val="233044"/>
-          <w:sz w:val="17"/>
-        </w:rPr>
         <w:t xml:space="preserve">robin context deliver PREVIEW --confirm HASH     # Non-interactive delivery</w:t>
-      </w:r>
-      <w:r>
-        <w:rPr>
-          <w:rFonts w:ascii="DejaVu Sans Mono" w:hAnsi="DejaVu Sans Mono"/>
-          <w:b w:val="0"/>
-          <w:color w:val="233044"/>
-          <w:sz w:val="17"/>
-        </w:rPr>
         <w:br/>
-      </w:r>
-      <w:r>
-        <w:rPr>
-          <w:rFonts w:ascii="DejaVu Sans Mono" w:hAnsi="DejaVu Sans Mono"/>
-          <w:b w:val="0"/>
-          <w:color w:val="233044"/>
-          <w:sz w:val="17"/>
-        </w:rPr>
         <w:t xml:space="preserve">robin compare --task TASK</w:t>
-      </w:r>
-      <w:r>
-        <w:rPr>
-          <w:rFonts w:ascii="DejaVu Sans Mono" w:hAnsi="DejaVu Sans Mono"/>
-          <w:b w:val="0"/>
-          <w:color w:val="233044"/>
-          <w:sz w:val="17"/>
-        </w:rPr>
         <w:br/>
-      </w:r>
-      <w:r>
-        <w:rPr>
-          <w:rFonts w:ascii="DejaVu Sans Mono" w:hAnsi="DejaVu Sans Mono"/>
-          <w:b w:val="0"/>
-          <w:color w:val="233044"/>
-          <w:sz w:val="17"/>
-        </w:rPr>
         <w:t xml:space="preserve">robin synthesize --task TASK --agent NAME --findings ID,...</w:t>
-      </w:r>
-      <w:r>
-        <w:rPr>
-          <w:rFonts w:ascii="DejaVu Sans Mono" w:hAnsi="DejaVu Sans Mono"/>
-          <w:b w:val="0"/>
-          <w:color w:val="233044"/>
-          <w:sz w:val="17"/>
-        </w:rPr>
         <w:br/>
-      </w:r>
-      <w:r>
-        <w:rPr>
-          <w:rFonts w:ascii="DejaVu Sans Mono" w:hAnsi="DejaVu Sans Mono"/>
-          <w:b w:val="0"/>
-          <w:color w:val="233044"/>
-          <w:sz w:val="17"/>
-        </w:rPr>
         <w:t xml:space="preserve">robin doctor                  # Runtime and capability diagnostics</w:t>
-      </w:r>
-      <w:r>
-        <w:rPr>
-          <w:rFonts w:ascii="DejaVu Sans Mono" w:hAnsi="DejaVu Sans Mono"/>
-          <w:b w:val="0"/>
-          <w:color w:val="233044"/>
-          <w:sz w:val="17"/>
-        </w:rPr>
         <w:br/>
-      </w:r>
-      <w:r>
-        <w:rPr>
-          <w:rFonts w:ascii="DejaVu Sans Mono" w:hAnsi="DejaVu Sans Mono"/>
-          <w:b w:val="0"/>
-          <w:color w:val="233044"/>
-          <w:sz w:val="17"/>
-        </w:rPr>
+        <w:t xml:space="preserve">robin hooks install RUNTIME   # Opt-in; previews the change first</w:t>
+        <w:br/>
+        <w:t xml:space="preserve">robin hooks uninstall RUNTIME # Removes only Robin entries</w:t>
+        <w:br/>
         <w:t xml:space="preserve"># SESSION is a Robin session ID; SOURCE is a finding ID or excerpt reference.</w:t>
       </w:r>
     </w:p>

</xml_diff>